<commit_message>
Add conclusion to prediploma practice report
Co-authored-by: Dmitry <Enotfttp@users.noreply.github.com>
</commit_message>
<xml_diff>
--- a/src/diplom/otchet_prediplomnaya_praktika_tns_energo_nn.docx
+++ b/src/diplom/otchet_prediplomnaya_praktika_tns_energo_nn.docx
@@ -338,6 +338,20 @@
           <w:rFonts w:ascii="Times New Roman" w:hAnsi="Times New Roman" w:eastAsia="Times New Roman"/>
           <w:sz w:val="28"/>
         </w:rPr>
+        <w:t>Заключение</w:t>
+      </w:r>
+    </w:p>
+    <w:p>
+      <w:pPr>
+        <w:spacing w:line="360" w:lineRule="auto"/>
+        <w:ind w:firstLine="709"/>
+        <w:jc w:val="both"/>
+      </w:pPr>
+      <w:r>
+        <w:rPr>
+          <w:rFonts w:ascii="Times New Roman" w:hAnsi="Times New Roman" w:eastAsia="Times New Roman"/>
+          <w:sz w:val="28"/>
+        </w:rPr>
         <w:t>Список использованных источников</w:t>
       </w:r>
     </w:p>
@@ -661,7 +675,7 @@
         <w:spacing w:line="360" w:lineRule="auto"/>
       </w:pPr>
       <w:r>
-        <w:t>1. **Продажа электроэнергии и расчеты с потребителями.** Это основной бизнес-процесс, включающий начисления, выставление счетов, прием платежей, обработку показаний и сопровождение договоров.</w:t>
+        <w:t>1. Продажа электроэнергии и расчеты с потребителями. Это основной бизнес-процесс, включающий начисления, выставление счетов, прием платежей, обработку показаний и сопровождение договоров.</w:t>
       </w:r>
     </w:p>
     <w:p>
@@ -670,7 +684,7 @@
         <w:spacing w:line="360" w:lineRule="auto"/>
       </w:pPr>
       <w:r>
-        <w:t>2. **Клиентское обслуживание.** Включает работу с обращениями, консультации, личные кабинеты, очные и дистанционные каналы взаимодействия.</w:t>
+        <w:t>2. Клиентское обслуживание. Включает работу с обращениями, консультации, личные кабинеты, очные и дистанционные каналы взаимодействия.</w:t>
       </w:r>
     </w:p>
     <w:p>
@@ -679,7 +693,7 @@
         <w:spacing w:line="360" w:lineRule="auto"/>
       </w:pPr>
       <w:r>
-        <w:t>3. **Работа с задолженностью.** Для энергосбытовой компании управление дебиторской задолженностью является одним из наиболее чувствительных направлений, поскольку задолженность потребителей влияет на оборотный капитал и финансовый результат.</w:t>
+        <w:t>3. Работа с задолженностью. Для энергосбытовой компании управление дебиторской задолженностью является одним из наиболее чувствительных направлений, поскольку задолженность потребителей влияет на оборотный капитал и финансовый результат.</w:t>
       </w:r>
     </w:p>
     <w:p>
@@ -688,7 +702,7 @@
         <w:spacing w:line="360" w:lineRule="auto"/>
       </w:pPr>
       <w:r>
-        <w:t>4. **Правовое сопровождение.** Включает договорную работу, судебно-претензионную деятельность, корпоративное управление и взаимодействие с регулирующими органами.</w:t>
+        <w:t>4. Правовое сопровождение. Включает договорную работу, судебно-претензионную деятельность, корпоративное управление и взаимодействие с регулирующими органами.</w:t>
       </w:r>
     </w:p>
     <w:p>
@@ -697,7 +711,7 @@
         <w:spacing w:line="360" w:lineRule="auto"/>
       </w:pPr>
       <w:r>
-        <w:t>5. **Технологическая и информационная поддержка.** Компания зависит от информационных систем учета, начислений, документооборота, клиентских сервисов и защиты данных.</w:t>
+        <w:t>5. Технологическая и информационная поддержка. Компания зависит от информационных систем учета, начислений, документооборота, клиентских сервисов и защиты данных.</w:t>
       </w:r>
     </w:p>
     <w:p>
@@ -706,7 +720,7 @@
         <w:spacing w:line="360" w:lineRule="auto"/>
       </w:pPr>
       <w:r>
-        <w:t>6. **Управление персоналом.** Подбор, адаптация, обучение, оплата труда, кадровое делопроизводство и мотивация работников обеспечивают устойчивость всех перечисленных процессов.</w:t>
+        <w:t>6. Управление персоналом. Подбор, адаптация, обучение, оплата труда, кадровое делопроизводство и мотивация работников обеспечивают устойчивость всех перечисленных процессов.</w:t>
       </w:r>
     </w:p>
     <w:p>
@@ -781,6 +795,7 @@
           <w:p>
             <w:pPr>
               <w:spacing w:line="240" w:lineRule="auto"/>
+              <w:jc w:val="center"/>
             </w:pPr>
             <w:r>
               <w:rPr>
@@ -801,6 +816,7 @@
           <w:p>
             <w:pPr>
               <w:spacing w:line="240" w:lineRule="auto"/>
+              <w:jc w:val="center"/>
             </w:pPr>
             <w:r>
               <w:rPr>
@@ -821,6 +837,7 @@
           <w:p>
             <w:pPr>
               <w:spacing w:line="240" w:lineRule="auto"/>
+              <w:jc w:val="center"/>
             </w:pPr>
             <w:r>
               <w:rPr>
@@ -842,6 +859,7 @@
           <w:p>
             <w:pPr>
               <w:spacing w:line="240" w:lineRule="auto"/>
+              <w:jc w:val="left"/>
             </w:pPr>
             <w:r>
               <w:rPr>
@@ -861,6 +879,7 @@
           <w:p>
             <w:pPr>
               <w:spacing w:line="240" w:lineRule="auto"/>
+              <w:jc w:val="left"/>
             </w:pPr>
             <w:r>
               <w:rPr>
@@ -880,6 +899,7 @@
           <w:p>
             <w:pPr>
               <w:spacing w:line="240" w:lineRule="auto"/>
+              <w:jc w:val="left"/>
             </w:pPr>
             <w:r>
               <w:rPr>
@@ -901,6 +921,7 @@
           <w:p>
             <w:pPr>
               <w:spacing w:line="240" w:lineRule="auto"/>
+              <w:jc w:val="left"/>
             </w:pPr>
             <w:r>
               <w:rPr>
@@ -920,6 +941,7 @@
           <w:p>
             <w:pPr>
               <w:spacing w:line="240" w:lineRule="auto"/>
+              <w:jc w:val="left"/>
             </w:pPr>
             <w:r>
               <w:rPr>
@@ -939,6 +961,7 @@
           <w:p>
             <w:pPr>
               <w:spacing w:line="240" w:lineRule="auto"/>
+              <w:jc w:val="left"/>
             </w:pPr>
             <w:r>
               <w:rPr>
@@ -960,6 +983,7 @@
           <w:p>
             <w:pPr>
               <w:spacing w:line="240" w:lineRule="auto"/>
+              <w:jc w:val="left"/>
             </w:pPr>
             <w:r>
               <w:rPr>
@@ -979,6 +1003,7 @@
           <w:p>
             <w:pPr>
               <w:spacing w:line="240" w:lineRule="auto"/>
+              <w:jc w:val="left"/>
             </w:pPr>
             <w:r>
               <w:rPr>
@@ -998,6 +1023,7 @@
           <w:p>
             <w:pPr>
               <w:spacing w:line="240" w:lineRule="auto"/>
+              <w:jc w:val="left"/>
             </w:pPr>
             <w:r>
               <w:rPr>
@@ -1019,6 +1045,7 @@
           <w:p>
             <w:pPr>
               <w:spacing w:line="240" w:lineRule="auto"/>
+              <w:jc w:val="left"/>
             </w:pPr>
             <w:r>
               <w:rPr>
@@ -1038,6 +1065,7 @@
           <w:p>
             <w:pPr>
               <w:spacing w:line="240" w:lineRule="auto"/>
+              <w:jc w:val="left"/>
             </w:pPr>
             <w:r>
               <w:rPr>
@@ -1057,6 +1085,7 @@
           <w:p>
             <w:pPr>
               <w:spacing w:line="240" w:lineRule="auto"/>
+              <w:jc w:val="left"/>
             </w:pPr>
             <w:r>
               <w:rPr>
@@ -1078,6 +1107,7 @@
           <w:p>
             <w:pPr>
               <w:spacing w:line="240" w:lineRule="auto"/>
+              <w:jc w:val="left"/>
             </w:pPr>
             <w:r>
               <w:rPr>
@@ -1097,6 +1127,7 @@
           <w:p>
             <w:pPr>
               <w:spacing w:line="240" w:lineRule="auto"/>
+              <w:jc w:val="left"/>
             </w:pPr>
             <w:r>
               <w:rPr>
@@ -1116,6 +1147,7 @@
           <w:p>
             <w:pPr>
               <w:spacing w:line="240" w:lineRule="auto"/>
+              <w:jc w:val="left"/>
             </w:pPr>
             <w:r>
               <w:rPr>
@@ -1137,6 +1169,7 @@
           <w:p>
             <w:pPr>
               <w:spacing w:line="240" w:lineRule="auto"/>
+              <w:jc w:val="left"/>
             </w:pPr>
             <w:r>
               <w:rPr>
@@ -1156,6 +1189,7 @@
           <w:p>
             <w:pPr>
               <w:spacing w:line="240" w:lineRule="auto"/>
+              <w:jc w:val="left"/>
             </w:pPr>
             <w:r>
               <w:rPr>
@@ -1175,6 +1209,7 @@
           <w:p>
             <w:pPr>
               <w:spacing w:line="240" w:lineRule="auto"/>
+              <w:jc w:val="left"/>
             </w:pPr>
             <w:r>
               <w:rPr>
@@ -1287,7 +1322,7 @@
         <w:spacing w:line="360" w:lineRule="auto"/>
       </w:pPr>
       <w:r>
-        <w:t>**Генеральный директор** - общее руководство деятельностью Общества, принятие управленческих решений, координация заместителей и ключевых департаментов.</w:t>
+        <w:t>Генеральный директор - общее руководство деятельностью Общества, принятие управленческих решений, координация заместителей и ключевых департаментов.</w:t>
       </w:r>
     </w:p>
     <w:p>
@@ -1296,7 +1331,7 @@
         <w:spacing w:line="360" w:lineRule="auto"/>
       </w:pPr>
       <w:r>
-        <w:t>**Экономика и финансы** - финансовый отдел, планово-экономический отдел, бухгалтерия. Блок отвечает за бюджетирование, учет, финансовый контроль, планирование и отчетность.</w:t>
+        <w:t>Экономика и финансы - финансовый отдел, планово-экономический отдел, бухгалтерия. Блок отвечает за бюджетирование, учет, финансовый контроль, планирование и отчетность.</w:t>
       </w:r>
     </w:p>
     <w:p>
@@ -1305,7 +1340,7 @@
         <w:spacing w:line="360" w:lineRule="auto"/>
       </w:pPr>
       <w:r>
-        <w:t>**Реализация электроэнергии** - подразделения, связанные с учетом отпуска энергии, балансами, начислениями, задолженностью, техническим аудитом и договорной работой.</w:t>
+        <w:t>Реализация электроэнергии - подразделения, связанные с учетом отпуска энергии, балансами, начислениями, задолженностью, техническим аудитом и договорной работой.</w:t>
       </w:r>
     </w:p>
     <w:p>
@@ -1314,7 +1349,7 @@
         <w:spacing w:line="360" w:lineRule="auto"/>
       </w:pPr>
       <w:r>
-        <w:t>**Работа с потребителями** - клиентские процессы, бытовые потребители, обращения, качество клиентского обслуживания, маркетинг и общественные коммуникации.</w:t>
+        <w:t>Работа с потребителями - клиентские процессы, бытовые потребители, обращения, качество клиентского обслуживания, маркетинг и общественные коммуникации.</w:t>
       </w:r>
     </w:p>
     <w:p>
@@ -1323,7 +1358,7 @@
         <w:spacing w:line="360" w:lineRule="auto"/>
       </w:pPr>
       <w:r>
-        <w:t>**Судебно-правовая работа и корпоративное управление** - договорное сопровождение, исковая работа, нормативно-правовое обеспечение, корпоративные процедуры.</w:t>
+        <w:t>Судебно-правовая работа и корпоративное управление - договорное сопровождение, исковая работа, нормативно-правовое обеспечение, корпоративные процедуры.</w:t>
       </w:r>
     </w:p>
     <w:p>
@@ -1332,7 +1367,7 @@
         <w:spacing w:line="360" w:lineRule="auto"/>
       </w:pPr>
       <w:r>
-        <w:t>**Безопасность** - экономическая безопасность, информационная безопасность, энергоинспекция и контрольные функции.</w:t>
+        <w:t>Безопасность - экономическая безопасность, информационная безопасность, энергоинспекция и контрольные функции.</w:t>
       </w:r>
     </w:p>
     <w:p>
@@ -1341,7 +1376,7 @@
         <w:spacing w:line="360" w:lineRule="auto"/>
       </w:pPr>
       <w:r>
-        <w:t>**Системы учета и развитие** - эксплуатация и внедрение систем учета электроэнергии, развитие интеллектуальных систем учета.</w:t>
+        <w:t>Системы учета и развитие - эксплуатация и внедрение систем учета электроэнергии, развитие интеллектуальных систем учета.</w:t>
       </w:r>
     </w:p>
     <w:p>
@@ -1350,7 +1385,7 @@
         <w:spacing w:line="360" w:lineRule="auto"/>
       </w:pPr>
       <w:r>
-        <w:t>**Управление персоналом** - кадровое администрирование, организация труда и заработной платы, подбор, обучение и развитие персонала.</w:t>
+        <w:t>Управление персоналом - кадровое администрирование, организация труда и заработной платы, подбор, обучение и развитие персонала.</w:t>
       </w:r>
     </w:p>
     <w:p>
@@ -1359,7 +1394,7 @@
         <w:spacing w:line="360" w:lineRule="auto"/>
       </w:pPr>
       <w:r>
-        <w:t>**Обеспечение деятельности** - материально-техническое снабжение, закупки, общий отдел, инвестиционная деятельность, гражданская оборона и охрана труда.</w:t>
+        <w:t>Обеспечение деятельности - материально-техническое снабжение, закупки, общий отдел, инвестиционная деятельность, гражданская оборона и охрана труда.</w:t>
       </w:r>
     </w:p>
     <w:p>
@@ -1368,7 +1403,7 @@
         <w:spacing w:line="360" w:lineRule="auto"/>
       </w:pPr>
       <w:r>
-        <w:t>**Информационные технологии** - эксплуатация инфраструктуры, информационные системы и техническое обеспечение.</w:t>
+        <w:t>Информационные технологии - эксплуатация инфраструктуры, информационные системы и техническое обеспечение.</w:t>
       </w:r>
     </w:p>
     <w:p>
@@ -1377,7 +1412,7 @@
         <w:spacing w:line="360" w:lineRule="auto"/>
       </w:pPr>
       <w:r>
-        <w:t>**Территориальные отделения** - Арзамасское, Балахнинское, Выксунское, Городское, Кстовское, Семеновское, Сергачское, Шахунское отделения.</w:t>
+        <w:t>Территориальные отделения - Арзамасское, Балахнинское, Выксунское, Городское, Кстовское, Семеновское, Сергачское, Шахунское отделения.</w:t>
       </w:r>
     </w:p>
     <w:p>
@@ -1550,6 +1585,7 @@
           <w:p>
             <w:pPr>
               <w:spacing w:line="240" w:lineRule="auto"/>
+              <w:jc w:val="center"/>
             </w:pPr>
             <w:r>
               <w:rPr>
@@ -1570,6 +1606,7 @@
           <w:p>
             <w:pPr>
               <w:spacing w:line="240" w:lineRule="auto"/>
+              <w:jc w:val="center"/>
             </w:pPr>
             <w:r>
               <w:rPr>
@@ -1590,6 +1627,7 @@
           <w:p>
             <w:pPr>
               <w:spacing w:line="240" w:lineRule="auto"/>
+              <w:jc w:val="center"/>
             </w:pPr>
             <w:r>
               <w:rPr>
@@ -1610,6 +1648,7 @@
           <w:p>
             <w:pPr>
               <w:spacing w:line="240" w:lineRule="auto"/>
+              <w:jc w:val="center"/>
             </w:pPr>
             <w:r>
               <w:rPr>
@@ -1630,6 +1669,7 @@
           <w:p>
             <w:pPr>
               <w:spacing w:line="240" w:lineRule="auto"/>
+              <w:jc w:val="center"/>
             </w:pPr>
             <w:r>
               <w:rPr>
@@ -1650,6 +1690,7 @@
           <w:p>
             <w:pPr>
               <w:spacing w:line="240" w:lineRule="auto"/>
+              <w:jc w:val="center"/>
             </w:pPr>
             <w:r>
               <w:rPr>
@@ -1671,6 +1712,7 @@
           <w:p>
             <w:pPr>
               <w:spacing w:line="240" w:lineRule="auto"/>
+              <w:jc w:val="left"/>
             </w:pPr>
             <w:r>
               <w:rPr>
@@ -1690,6 +1732,7 @@
           <w:p>
             <w:pPr>
               <w:spacing w:line="240" w:lineRule="auto"/>
+              <w:jc w:val="left"/>
             </w:pPr>
             <w:r>
               <w:rPr>
@@ -1709,6 +1752,7 @@
           <w:p>
             <w:pPr>
               <w:spacing w:line="240" w:lineRule="auto"/>
+              <w:jc w:val="left"/>
             </w:pPr>
             <w:r>
               <w:rPr>
@@ -1728,6 +1772,7 @@
           <w:p>
             <w:pPr>
               <w:spacing w:line="240" w:lineRule="auto"/>
+              <w:jc w:val="left"/>
             </w:pPr>
             <w:r>
               <w:rPr>
@@ -1747,6 +1792,7 @@
           <w:p>
             <w:pPr>
               <w:spacing w:line="240" w:lineRule="auto"/>
+              <w:jc w:val="left"/>
             </w:pPr>
             <w:r>
               <w:rPr>
@@ -1766,6 +1812,7 @@
           <w:p>
             <w:pPr>
               <w:spacing w:line="240" w:lineRule="auto"/>
+              <w:jc w:val="left"/>
             </w:pPr>
             <w:r>
               <w:rPr>
@@ -1787,6 +1834,7 @@
           <w:p>
             <w:pPr>
               <w:spacing w:line="240" w:lineRule="auto"/>
+              <w:jc w:val="left"/>
             </w:pPr>
             <w:r>
               <w:rPr>
@@ -1806,6 +1854,7 @@
           <w:p>
             <w:pPr>
               <w:spacing w:line="240" w:lineRule="auto"/>
+              <w:jc w:val="left"/>
             </w:pPr>
             <w:r>
               <w:rPr>
@@ -1825,6 +1874,7 @@
           <w:p>
             <w:pPr>
               <w:spacing w:line="240" w:lineRule="auto"/>
+              <w:jc w:val="left"/>
             </w:pPr>
             <w:r>
               <w:rPr>
@@ -1844,6 +1894,7 @@
           <w:p>
             <w:pPr>
               <w:spacing w:line="240" w:lineRule="auto"/>
+              <w:jc w:val="left"/>
             </w:pPr>
             <w:r>
               <w:rPr>
@@ -1863,6 +1914,7 @@
           <w:p>
             <w:pPr>
               <w:spacing w:line="240" w:lineRule="auto"/>
+              <w:jc w:val="left"/>
             </w:pPr>
             <w:r>
               <w:rPr>
@@ -1882,6 +1934,7 @@
           <w:p>
             <w:pPr>
               <w:spacing w:line="240" w:lineRule="auto"/>
+              <w:jc w:val="left"/>
             </w:pPr>
             <w:r>
               <w:rPr>
@@ -1903,6 +1956,7 @@
           <w:p>
             <w:pPr>
               <w:spacing w:line="240" w:lineRule="auto"/>
+              <w:jc w:val="left"/>
             </w:pPr>
             <w:r>
               <w:rPr>
@@ -1922,6 +1976,7 @@
           <w:p>
             <w:pPr>
               <w:spacing w:line="240" w:lineRule="auto"/>
+              <w:jc w:val="left"/>
             </w:pPr>
             <w:r>
               <w:rPr>
@@ -1941,6 +1996,7 @@
           <w:p>
             <w:pPr>
               <w:spacing w:line="240" w:lineRule="auto"/>
+              <w:jc w:val="left"/>
             </w:pPr>
             <w:r>
               <w:rPr>
@@ -1960,6 +2016,7 @@
           <w:p>
             <w:pPr>
               <w:spacing w:line="240" w:lineRule="auto"/>
+              <w:jc w:val="left"/>
             </w:pPr>
             <w:r>
               <w:rPr>
@@ -1979,6 +2036,7 @@
           <w:p>
             <w:pPr>
               <w:spacing w:line="240" w:lineRule="auto"/>
+              <w:jc w:val="left"/>
             </w:pPr>
             <w:r>
               <w:rPr>
@@ -1998,6 +2056,7 @@
           <w:p>
             <w:pPr>
               <w:spacing w:line="240" w:lineRule="auto"/>
+              <w:jc w:val="left"/>
             </w:pPr>
             <w:r>
               <w:rPr>
@@ -2019,6 +2078,7 @@
           <w:p>
             <w:pPr>
               <w:spacing w:line="240" w:lineRule="auto"/>
+              <w:jc w:val="left"/>
             </w:pPr>
             <w:r>
               <w:rPr>
@@ -2038,6 +2098,7 @@
           <w:p>
             <w:pPr>
               <w:spacing w:line="240" w:lineRule="auto"/>
+              <w:jc w:val="left"/>
             </w:pPr>
             <w:r>
               <w:rPr>
@@ -2057,6 +2118,7 @@
           <w:p>
             <w:pPr>
               <w:spacing w:line="240" w:lineRule="auto"/>
+              <w:jc w:val="left"/>
             </w:pPr>
             <w:r>
               <w:rPr>
@@ -2076,6 +2138,7 @@
           <w:p>
             <w:pPr>
               <w:spacing w:line="240" w:lineRule="auto"/>
+              <w:jc w:val="left"/>
             </w:pPr>
             <w:r>
               <w:rPr>
@@ -2095,6 +2158,7 @@
           <w:p>
             <w:pPr>
               <w:spacing w:line="240" w:lineRule="auto"/>
+              <w:jc w:val="left"/>
             </w:pPr>
             <w:r>
               <w:rPr>
@@ -2114,6 +2178,7 @@
           <w:p>
             <w:pPr>
               <w:spacing w:line="240" w:lineRule="auto"/>
+              <w:jc w:val="left"/>
             </w:pPr>
             <w:r>
               <w:rPr>
@@ -2135,6 +2200,7 @@
           <w:p>
             <w:pPr>
               <w:spacing w:line="240" w:lineRule="auto"/>
+              <w:jc w:val="left"/>
             </w:pPr>
             <w:r>
               <w:rPr>
@@ -2154,6 +2220,7 @@
           <w:p>
             <w:pPr>
               <w:spacing w:line="240" w:lineRule="auto"/>
+              <w:jc w:val="left"/>
             </w:pPr>
             <w:r>
               <w:rPr>
@@ -2173,6 +2240,7 @@
           <w:p>
             <w:pPr>
               <w:spacing w:line="240" w:lineRule="auto"/>
+              <w:jc w:val="left"/>
             </w:pPr>
             <w:r>
               <w:rPr>
@@ -2192,6 +2260,7 @@
           <w:p>
             <w:pPr>
               <w:spacing w:line="240" w:lineRule="auto"/>
+              <w:jc w:val="left"/>
             </w:pPr>
             <w:r>
               <w:rPr>
@@ -2211,6 +2280,7 @@
           <w:p>
             <w:pPr>
               <w:spacing w:line="240" w:lineRule="auto"/>
+              <w:jc w:val="left"/>
             </w:pPr>
             <w:r>
               <w:rPr>
@@ -2230,6 +2300,7 @@
           <w:p>
             <w:pPr>
               <w:spacing w:line="240" w:lineRule="auto"/>
+              <w:jc w:val="left"/>
             </w:pPr>
             <w:r>
               <w:rPr>
@@ -2251,6 +2322,7 @@
           <w:p>
             <w:pPr>
               <w:spacing w:line="240" w:lineRule="auto"/>
+              <w:jc w:val="left"/>
             </w:pPr>
             <w:r>
               <w:rPr>
@@ -2270,6 +2342,7 @@
           <w:p>
             <w:pPr>
               <w:spacing w:line="240" w:lineRule="auto"/>
+              <w:jc w:val="left"/>
             </w:pPr>
             <w:r>
               <w:rPr>
@@ -2289,6 +2362,7 @@
           <w:p>
             <w:pPr>
               <w:spacing w:line="240" w:lineRule="auto"/>
+              <w:jc w:val="left"/>
             </w:pPr>
             <w:r>
               <w:rPr>
@@ -2308,6 +2382,7 @@
           <w:p>
             <w:pPr>
               <w:spacing w:line="240" w:lineRule="auto"/>
+              <w:jc w:val="left"/>
             </w:pPr>
             <w:r>
               <w:rPr>
@@ -2327,6 +2402,7 @@
           <w:p>
             <w:pPr>
               <w:spacing w:line="240" w:lineRule="auto"/>
+              <w:jc w:val="left"/>
             </w:pPr>
             <w:r>
               <w:rPr>
@@ -2346,6 +2422,7 @@
           <w:p>
             <w:pPr>
               <w:spacing w:line="240" w:lineRule="auto"/>
+              <w:jc w:val="left"/>
             </w:pPr>
             <w:r>
               <w:rPr>
@@ -2367,6 +2444,7 @@
           <w:p>
             <w:pPr>
               <w:spacing w:line="240" w:lineRule="auto"/>
+              <w:jc w:val="left"/>
             </w:pPr>
             <w:r>
               <w:rPr>
@@ -2386,6 +2464,7 @@
           <w:p>
             <w:pPr>
               <w:spacing w:line="240" w:lineRule="auto"/>
+              <w:jc w:val="left"/>
             </w:pPr>
             <w:r>
               <w:rPr>
@@ -2405,6 +2484,7 @@
           <w:p>
             <w:pPr>
               <w:spacing w:line="240" w:lineRule="auto"/>
+              <w:jc w:val="left"/>
             </w:pPr>
             <w:r>
               <w:rPr>
@@ -2424,6 +2504,7 @@
           <w:p>
             <w:pPr>
               <w:spacing w:line="240" w:lineRule="auto"/>
+              <w:jc w:val="left"/>
             </w:pPr>
             <w:r>
               <w:rPr>
@@ -2443,6 +2524,7 @@
           <w:p>
             <w:pPr>
               <w:spacing w:line="240" w:lineRule="auto"/>
+              <w:jc w:val="left"/>
             </w:pPr>
             <w:r>
               <w:rPr>
@@ -2462,6 +2544,7 @@
           <w:p>
             <w:pPr>
               <w:spacing w:line="240" w:lineRule="auto"/>
+              <w:jc w:val="left"/>
             </w:pPr>
             <w:r>
               <w:rPr>
@@ -2483,6 +2566,7 @@
           <w:p>
             <w:pPr>
               <w:spacing w:line="240" w:lineRule="auto"/>
+              <w:jc w:val="left"/>
             </w:pPr>
             <w:r>
               <w:rPr>
@@ -2502,6 +2586,7 @@
           <w:p>
             <w:pPr>
               <w:spacing w:line="240" w:lineRule="auto"/>
+              <w:jc w:val="left"/>
             </w:pPr>
             <w:r>
               <w:rPr>
@@ -2521,6 +2606,7 @@
           <w:p>
             <w:pPr>
               <w:spacing w:line="240" w:lineRule="auto"/>
+              <w:jc w:val="left"/>
             </w:pPr>
             <w:r>
               <w:rPr>
@@ -2540,6 +2626,7 @@
           <w:p>
             <w:pPr>
               <w:spacing w:line="240" w:lineRule="auto"/>
+              <w:jc w:val="left"/>
             </w:pPr>
             <w:r>
               <w:rPr>
@@ -2559,6 +2646,7 @@
           <w:p>
             <w:pPr>
               <w:spacing w:line="240" w:lineRule="auto"/>
+              <w:jc w:val="left"/>
             </w:pPr>
             <w:r>
               <w:rPr>
@@ -2578,6 +2666,7 @@
           <w:p>
             <w:pPr>
               <w:spacing w:line="240" w:lineRule="auto"/>
+              <w:jc w:val="left"/>
             </w:pPr>
             <w:r>
               <w:rPr>
@@ -2871,6 +2960,7 @@
           <w:p>
             <w:pPr>
               <w:spacing w:line="240" w:lineRule="auto"/>
+              <w:jc w:val="center"/>
             </w:pPr>
             <w:r>
               <w:rPr>
@@ -2891,6 +2981,7 @@
           <w:p>
             <w:pPr>
               <w:spacing w:line="240" w:lineRule="auto"/>
+              <w:jc w:val="center"/>
             </w:pPr>
             <w:r>
               <w:rPr>
@@ -2911,6 +3002,7 @@
           <w:p>
             <w:pPr>
               <w:spacing w:line="240" w:lineRule="auto"/>
+              <w:jc w:val="center"/>
             </w:pPr>
             <w:r>
               <w:rPr>
@@ -2932,6 +3024,7 @@
           <w:p>
             <w:pPr>
               <w:spacing w:line="240" w:lineRule="auto"/>
+              <w:jc w:val="left"/>
             </w:pPr>
             <w:r>
               <w:rPr>
@@ -2951,6 +3044,7 @@
           <w:p>
             <w:pPr>
               <w:spacing w:line="240" w:lineRule="auto"/>
+              <w:jc w:val="left"/>
             </w:pPr>
             <w:r>
               <w:rPr>
@@ -2970,6 +3064,7 @@
           <w:p>
             <w:pPr>
               <w:spacing w:line="240" w:lineRule="auto"/>
+              <w:jc w:val="left"/>
             </w:pPr>
             <w:r>
               <w:rPr>
@@ -2991,6 +3086,7 @@
           <w:p>
             <w:pPr>
               <w:spacing w:line="240" w:lineRule="auto"/>
+              <w:jc w:val="left"/>
             </w:pPr>
             <w:r>
               <w:rPr>
@@ -3010,6 +3106,7 @@
           <w:p>
             <w:pPr>
               <w:spacing w:line="240" w:lineRule="auto"/>
+              <w:jc w:val="left"/>
             </w:pPr>
             <w:r>
               <w:rPr>
@@ -3029,6 +3126,7 @@
           <w:p>
             <w:pPr>
               <w:spacing w:line="240" w:lineRule="auto"/>
+              <w:jc w:val="left"/>
             </w:pPr>
             <w:r>
               <w:rPr>
@@ -3050,6 +3148,7 @@
           <w:p>
             <w:pPr>
               <w:spacing w:line="240" w:lineRule="auto"/>
+              <w:jc w:val="left"/>
             </w:pPr>
             <w:r>
               <w:rPr>
@@ -3069,6 +3168,7 @@
           <w:p>
             <w:pPr>
               <w:spacing w:line="240" w:lineRule="auto"/>
+              <w:jc w:val="left"/>
             </w:pPr>
             <w:r>
               <w:rPr>
@@ -3088,6 +3188,7 @@
           <w:p>
             <w:pPr>
               <w:spacing w:line="240" w:lineRule="auto"/>
+              <w:jc w:val="left"/>
             </w:pPr>
             <w:r>
               <w:rPr>
@@ -3109,6 +3210,7 @@
           <w:p>
             <w:pPr>
               <w:spacing w:line="240" w:lineRule="auto"/>
+              <w:jc w:val="left"/>
             </w:pPr>
             <w:r>
               <w:rPr>
@@ -3128,6 +3230,7 @@
           <w:p>
             <w:pPr>
               <w:spacing w:line="240" w:lineRule="auto"/>
+              <w:jc w:val="left"/>
             </w:pPr>
             <w:r>
               <w:rPr>
@@ -3147,6 +3250,7 @@
           <w:p>
             <w:pPr>
               <w:spacing w:line="240" w:lineRule="auto"/>
+              <w:jc w:val="left"/>
             </w:pPr>
             <w:r>
               <w:rPr>
@@ -3168,6 +3272,7 @@
           <w:p>
             <w:pPr>
               <w:spacing w:line="240" w:lineRule="auto"/>
+              <w:jc w:val="left"/>
             </w:pPr>
             <w:r>
               <w:rPr>
@@ -3187,6 +3292,7 @@
           <w:p>
             <w:pPr>
               <w:spacing w:line="240" w:lineRule="auto"/>
+              <w:jc w:val="left"/>
             </w:pPr>
             <w:r>
               <w:rPr>
@@ -3206,6 +3312,7 @@
           <w:p>
             <w:pPr>
               <w:spacing w:line="240" w:lineRule="auto"/>
+              <w:jc w:val="left"/>
             </w:pPr>
             <w:r>
               <w:rPr>
@@ -3227,6 +3334,7 @@
           <w:p>
             <w:pPr>
               <w:spacing w:line="240" w:lineRule="auto"/>
+              <w:jc w:val="left"/>
             </w:pPr>
             <w:r>
               <w:rPr>
@@ -3246,6 +3354,7 @@
           <w:p>
             <w:pPr>
               <w:spacing w:line="240" w:lineRule="auto"/>
+              <w:jc w:val="left"/>
             </w:pPr>
             <w:r>
               <w:rPr>
@@ -3265,6 +3374,7 @@
           <w:p>
             <w:pPr>
               <w:spacing w:line="240" w:lineRule="auto"/>
+              <w:jc w:val="left"/>
             </w:pPr>
             <w:r>
               <w:rPr>
@@ -3286,6 +3396,7 @@
           <w:p>
             <w:pPr>
               <w:spacing w:line="240" w:lineRule="auto"/>
+              <w:jc w:val="left"/>
             </w:pPr>
             <w:r>
               <w:rPr>
@@ -3305,6 +3416,7 @@
           <w:p>
             <w:pPr>
               <w:spacing w:line="240" w:lineRule="auto"/>
+              <w:jc w:val="left"/>
             </w:pPr>
             <w:r>
               <w:rPr>
@@ -3324,6 +3436,7 @@
           <w:p>
             <w:pPr>
               <w:spacing w:line="240" w:lineRule="auto"/>
+              <w:jc w:val="left"/>
             </w:pPr>
             <w:r>
               <w:rPr>
@@ -3345,6 +3458,7 @@
           <w:p>
             <w:pPr>
               <w:spacing w:line="240" w:lineRule="auto"/>
+              <w:jc w:val="left"/>
             </w:pPr>
             <w:r>
               <w:rPr>
@@ -3364,6 +3478,7 @@
           <w:p>
             <w:pPr>
               <w:spacing w:line="240" w:lineRule="auto"/>
+              <w:jc w:val="left"/>
             </w:pPr>
             <w:r>
               <w:rPr>
@@ -3383,6 +3498,7 @@
           <w:p>
             <w:pPr>
               <w:spacing w:line="240" w:lineRule="auto"/>
+              <w:jc w:val="left"/>
             </w:pPr>
             <w:r>
               <w:rPr>
@@ -3735,6 +3851,7 @@
           <w:p>
             <w:pPr>
               <w:spacing w:line="240" w:lineRule="auto"/>
+              <w:jc w:val="center"/>
             </w:pPr>
             <w:r>
               <w:rPr>
@@ -3755,6 +3872,7 @@
           <w:p>
             <w:pPr>
               <w:spacing w:line="240" w:lineRule="auto"/>
+              <w:jc w:val="center"/>
             </w:pPr>
             <w:r>
               <w:rPr>
@@ -3775,6 +3893,7 @@
           <w:p>
             <w:pPr>
               <w:spacing w:line="240" w:lineRule="auto"/>
+              <w:jc w:val="center"/>
             </w:pPr>
             <w:r>
               <w:rPr>
@@ -3795,6 +3914,7 @@
           <w:p>
             <w:pPr>
               <w:spacing w:line="240" w:lineRule="auto"/>
+              <w:jc w:val="center"/>
             </w:pPr>
             <w:r>
               <w:rPr>
@@ -3816,6 +3936,7 @@
           <w:p>
             <w:pPr>
               <w:spacing w:line="240" w:lineRule="auto"/>
+              <w:jc w:val="left"/>
             </w:pPr>
             <w:r>
               <w:rPr>
@@ -3835,6 +3956,7 @@
           <w:p>
             <w:pPr>
               <w:spacing w:line="240" w:lineRule="auto"/>
+              <w:jc w:val="left"/>
             </w:pPr>
             <w:r>
               <w:rPr>
@@ -3854,6 +3976,7 @@
           <w:p>
             <w:pPr>
               <w:spacing w:line="240" w:lineRule="auto"/>
+              <w:jc w:val="left"/>
             </w:pPr>
             <w:r>
               <w:rPr>
@@ -3873,6 +3996,7 @@
           <w:p>
             <w:pPr>
               <w:spacing w:line="240" w:lineRule="auto"/>
+              <w:jc w:val="left"/>
             </w:pPr>
             <w:r>
               <w:rPr>
@@ -3894,6 +4018,7 @@
           <w:p>
             <w:pPr>
               <w:spacing w:line="240" w:lineRule="auto"/>
+              <w:jc w:val="left"/>
             </w:pPr>
             <w:r>
               <w:rPr>
@@ -3913,6 +4038,7 @@
           <w:p>
             <w:pPr>
               <w:spacing w:line="240" w:lineRule="auto"/>
+              <w:jc w:val="left"/>
             </w:pPr>
             <w:r>
               <w:rPr>
@@ -3932,6 +4058,7 @@
           <w:p>
             <w:pPr>
               <w:spacing w:line="240" w:lineRule="auto"/>
+              <w:jc w:val="left"/>
             </w:pPr>
             <w:r>
               <w:rPr>
@@ -3951,6 +4078,7 @@
           <w:p>
             <w:pPr>
               <w:spacing w:line="240" w:lineRule="auto"/>
+              <w:jc w:val="left"/>
             </w:pPr>
             <w:r>
               <w:rPr>
@@ -3972,6 +4100,7 @@
           <w:p>
             <w:pPr>
               <w:spacing w:line="240" w:lineRule="auto"/>
+              <w:jc w:val="left"/>
             </w:pPr>
             <w:r>
               <w:rPr>
@@ -3991,6 +4120,7 @@
           <w:p>
             <w:pPr>
               <w:spacing w:line="240" w:lineRule="auto"/>
+              <w:jc w:val="left"/>
             </w:pPr>
             <w:r>
               <w:rPr>
@@ -4010,6 +4140,7 @@
           <w:p>
             <w:pPr>
               <w:spacing w:line="240" w:lineRule="auto"/>
+              <w:jc w:val="left"/>
             </w:pPr>
             <w:r>
               <w:rPr>
@@ -4029,6 +4160,7 @@
           <w:p>
             <w:pPr>
               <w:spacing w:line="240" w:lineRule="auto"/>
+              <w:jc w:val="left"/>
             </w:pPr>
             <w:r>
               <w:rPr>
@@ -4050,6 +4182,7 @@
           <w:p>
             <w:pPr>
               <w:spacing w:line="240" w:lineRule="auto"/>
+              <w:jc w:val="left"/>
             </w:pPr>
             <w:r>
               <w:rPr>
@@ -4069,6 +4202,7 @@
           <w:p>
             <w:pPr>
               <w:spacing w:line="240" w:lineRule="auto"/>
+              <w:jc w:val="left"/>
             </w:pPr>
             <w:r>
               <w:rPr>
@@ -4088,6 +4222,7 @@
           <w:p>
             <w:pPr>
               <w:spacing w:line="240" w:lineRule="auto"/>
+              <w:jc w:val="left"/>
             </w:pPr>
             <w:r>
               <w:rPr>
@@ -4107,6 +4242,7 @@
           <w:p>
             <w:pPr>
               <w:spacing w:line="240" w:lineRule="auto"/>
+              <w:jc w:val="left"/>
             </w:pPr>
             <w:r>
               <w:rPr>
@@ -4128,6 +4264,7 @@
           <w:p>
             <w:pPr>
               <w:spacing w:line="240" w:lineRule="auto"/>
+              <w:jc w:val="left"/>
             </w:pPr>
             <w:r>
               <w:rPr>
@@ -4147,6 +4284,7 @@
           <w:p>
             <w:pPr>
               <w:spacing w:line="240" w:lineRule="auto"/>
+              <w:jc w:val="left"/>
             </w:pPr>
             <w:r>
               <w:rPr>
@@ -4166,6 +4304,7 @@
           <w:p>
             <w:pPr>
               <w:spacing w:line="240" w:lineRule="auto"/>
+              <w:jc w:val="left"/>
             </w:pPr>
             <w:r>
               <w:rPr>
@@ -4185,6 +4324,7 @@
           <w:p>
             <w:pPr>
               <w:spacing w:line="240" w:lineRule="auto"/>
+              <w:jc w:val="left"/>
             </w:pPr>
             <w:r>
               <w:rPr>
@@ -4206,6 +4346,7 @@
           <w:p>
             <w:pPr>
               <w:spacing w:line="240" w:lineRule="auto"/>
+              <w:jc w:val="left"/>
             </w:pPr>
             <w:r>
               <w:rPr>
@@ -4225,6 +4366,7 @@
           <w:p>
             <w:pPr>
               <w:spacing w:line="240" w:lineRule="auto"/>
+              <w:jc w:val="left"/>
             </w:pPr>
             <w:r>
               <w:rPr>
@@ -4244,6 +4386,7 @@
           <w:p>
             <w:pPr>
               <w:spacing w:line="240" w:lineRule="auto"/>
+              <w:jc w:val="left"/>
             </w:pPr>
             <w:r>
               <w:rPr>
@@ -4263,6 +4406,7 @@
           <w:p>
             <w:pPr>
               <w:spacing w:line="240" w:lineRule="auto"/>
+              <w:jc w:val="left"/>
             </w:pPr>
             <w:r>
               <w:rPr>
@@ -4327,6 +4471,7 @@
           <w:p>
             <w:pPr>
               <w:spacing w:line="240" w:lineRule="auto"/>
+              <w:jc w:val="center"/>
             </w:pPr>
             <w:r>
               <w:rPr>
@@ -4347,6 +4492,7 @@
           <w:p>
             <w:pPr>
               <w:spacing w:line="240" w:lineRule="auto"/>
+              <w:jc w:val="center"/>
             </w:pPr>
             <w:r>
               <w:rPr>
@@ -4367,6 +4513,7 @@
           <w:p>
             <w:pPr>
               <w:spacing w:line="240" w:lineRule="auto"/>
+              <w:jc w:val="center"/>
             </w:pPr>
             <w:r>
               <w:rPr>
@@ -4388,6 +4535,7 @@
           <w:p>
             <w:pPr>
               <w:spacing w:line="240" w:lineRule="auto"/>
+              <w:jc w:val="left"/>
             </w:pPr>
             <w:r>
               <w:rPr>
@@ -4407,6 +4555,7 @@
           <w:p>
             <w:pPr>
               <w:spacing w:line="240" w:lineRule="auto"/>
+              <w:jc w:val="left"/>
             </w:pPr>
             <w:r>
               <w:rPr>
@@ -4426,6 +4575,7 @@
           <w:p>
             <w:pPr>
               <w:spacing w:line="240" w:lineRule="auto"/>
+              <w:jc w:val="left"/>
             </w:pPr>
             <w:r>
               <w:rPr>
@@ -4447,6 +4597,7 @@
           <w:p>
             <w:pPr>
               <w:spacing w:line="240" w:lineRule="auto"/>
+              <w:jc w:val="left"/>
             </w:pPr>
             <w:r>
               <w:rPr>
@@ -4466,6 +4617,7 @@
           <w:p>
             <w:pPr>
               <w:spacing w:line="240" w:lineRule="auto"/>
+              <w:jc w:val="left"/>
             </w:pPr>
             <w:r>
               <w:rPr>
@@ -4485,6 +4637,7 @@
           <w:p>
             <w:pPr>
               <w:spacing w:line="240" w:lineRule="auto"/>
+              <w:jc w:val="left"/>
             </w:pPr>
             <w:r>
               <w:rPr>
@@ -4506,6 +4659,7 @@
           <w:p>
             <w:pPr>
               <w:spacing w:line="240" w:lineRule="auto"/>
+              <w:jc w:val="left"/>
             </w:pPr>
             <w:r>
               <w:rPr>
@@ -4525,6 +4679,7 @@
           <w:p>
             <w:pPr>
               <w:spacing w:line="240" w:lineRule="auto"/>
+              <w:jc w:val="left"/>
             </w:pPr>
             <w:r>
               <w:rPr>
@@ -4544,6 +4699,7 @@
           <w:p>
             <w:pPr>
               <w:spacing w:line="240" w:lineRule="auto"/>
+              <w:jc w:val="left"/>
             </w:pPr>
             <w:r>
               <w:rPr>
@@ -4565,6 +4721,7 @@
           <w:p>
             <w:pPr>
               <w:spacing w:line="240" w:lineRule="auto"/>
+              <w:jc w:val="left"/>
             </w:pPr>
             <w:r>
               <w:rPr>
@@ -4584,6 +4741,7 @@
           <w:p>
             <w:pPr>
               <w:spacing w:line="240" w:lineRule="auto"/>
+              <w:jc w:val="left"/>
             </w:pPr>
             <w:r>
               <w:rPr>
@@ -4603,6 +4761,7 @@
           <w:p>
             <w:pPr>
               <w:spacing w:line="240" w:lineRule="auto"/>
+              <w:jc w:val="left"/>
             </w:pPr>
             <w:r>
               <w:rPr>
@@ -4624,6 +4783,7 @@
           <w:p>
             <w:pPr>
               <w:spacing w:line="240" w:lineRule="auto"/>
+              <w:jc w:val="left"/>
             </w:pPr>
             <w:r>
               <w:rPr>
@@ -4643,6 +4803,7 @@
           <w:p>
             <w:pPr>
               <w:spacing w:line="240" w:lineRule="auto"/>
+              <w:jc w:val="left"/>
             </w:pPr>
             <w:r>
               <w:rPr>
@@ -4662,6 +4823,7 @@
           <w:p>
             <w:pPr>
               <w:spacing w:line="240" w:lineRule="auto"/>
+              <w:jc w:val="left"/>
             </w:pPr>
             <w:r>
               <w:rPr>
@@ -4683,6 +4845,7 @@
           <w:p>
             <w:pPr>
               <w:spacing w:line="240" w:lineRule="auto"/>
+              <w:jc w:val="left"/>
             </w:pPr>
             <w:r>
               <w:rPr>
@@ -4702,6 +4865,7 @@
           <w:p>
             <w:pPr>
               <w:spacing w:line="240" w:lineRule="auto"/>
+              <w:jc w:val="left"/>
             </w:pPr>
             <w:r>
               <w:rPr>
@@ -4721,6 +4885,7 @@
           <w:p>
             <w:pPr>
               <w:spacing w:line="240" w:lineRule="auto"/>
+              <w:jc w:val="left"/>
             </w:pPr>
             <w:r>
               <w:rPr>
@@ -4742,6 +4907,7 @@
           <w:p>
             <w:pPr>
               <w:spacing w:line="240" w:lineRule="auto"/>
+              <w:jc w:val="left"/>
             </w:pPr>
             <w:r>
               <w:rPr>
@@ -4761,6 +4927,7 @@
           <w:p>
             <w:pPr>
               <w:spacing w:line="240" w:lineRule="auto"/>
+              <w:jc w:val="left"/>
             </w:pPr>
             <w:r>
               <w:rPr>
@@ -4780,6 +4947,7 @@
           <w:p>
             <w:pPr>
               <w:spacing w:line="240" w:lineRule="auto"/>
+              <w:jc w:val="left"/>
             </w:pPr>
             <w:r>
               <w:rPr>
@@ -4801,6 +4969,7 @@
           <w:p>
             <w:pPr>
               <w:spacing w:line="240" w:lineRule="auto"/>
+              <w:jc w:val="left"/>
             </w:pPr>
             <w:r>
               <w:rPr>
@@ -4820,6 +4989,7 @@
           <w:p>
             <w:pPr>
               <w:spacing w:line="240" w:lineRule="auto"/>
+              <w:jc w:val="left"/>
             </w:pPr>
             <w:r>
               <w:rPr>
@@ -4839,6 +5009,7 @@
           <w:p>
             <w:pPr>
               <w:spacing w:line="240" w:lineRule="auto"/>
+              <w:jc w:val="left"/>
             </w:pPr>
             <w:r>
               <w:rPr>
@@ -4860,6 +5031,7 @@
           <w:p>
             <w:pPr>
               <w:spacing w:line="240" w:lineRule="auto"/>
+              <w:jc w:val="left"/>
             </w:pPr>
             <w:r>
               <w:rPr>
@@ -4879,6 +5051,7 @@
           <w:p>
             <w:pPr>
               <w:spacing w:line="240" w:lineRule="auto"/>
+              <w:jc w:val="left"/>
             </w:pPr>
             <w:r>
               <w:rPr>
@@ -4898,6 +5071,7 @@
           <w:p>
             <w:pPr>
               <w:spacing w:line="240" w:lineRule="auto"/>
+              <w:jc w:val="left"/>
             </w:pPr>
             <w:r>
               <w:rPr>
@@ -4919,6 +5093,7 @@
           <w:p>
             <w:pPr>
               <w:spacing w:line="240" w:lineRule="auto"/>
+              <w:jc w:val="left"/>
             </w:pPr>
             <w:r>
               <w:rPr>
@@ -4938,6 +5113,7 @@
           <w:p>
             <w:pPr>
               <w:spacing w:line="240" w:lineRule="auto"/>
+              <w:jc w:val="left"/>
             </w:pPr>
             <w:r>
               <w:rPr>
@@ -4957,6 +5133,7 @@
           <w:p>
             <w:pPr>
               <w:spacing w:line="240" w:lineRule="auto"/>
+              <w:jc w:val="left"/>
             </w:pPr>
             <w:r>
               <w:rPr>
@@ -4978,6 +5155,7 @@
           <w:p>
             <w:pPr>
               <w:spacing w:line="240" w:lineRule="auto"/>
+              <w:jc w:val="left"/>
             </w:pPr>
             <w:r>
               <w:rPr>
@@ -4997,6 +5175,7 @@
           <w:p>
             <w:pPr>
               <w:spacing w:line="240" w:lineRule="auto"/>
+              <w:jc w:val="left"/>
             </w:pPr>
             <w:r>
               <w:rPr>
@@ -5016,6 +5195,7 @@
           <w:p>
             <w:pPr>
               <w:spacing w:line="240" w:lineRule="auto"/>
+              <w:jc w:val="left"/>
             </w:pPr>
             <w:r>
               <w:rPr>
@@ -5037,6 +5217,7 @@
           <w:p>
             <w:pPr>
               <w:spacing w:line="240" w:lineRule="auto"/>
+              <w:jc w:val="left"/>
             </w:pPr>
             <w:r>
               <w:rPr>
@@ -5056,6 +5237,7 @@
           <w:p>
             <w:pPr>
               <w:spacing w:line="240" w:lineRule="auto"/>
+              <w:jc w:val="left"/>
             </w:pPr>
             <w:r>
               <w:rPr>
@@ -5075,6 +5257,7 @@
           <w:p>
             <w:pPr>
               <w:spacing w:line="240" w:lineRule="auto"/>
+              <w:jc w:val="left"/>
             </w:pPr>
             <w:r>
               <w:rPr>
@@ -5096,6 +5279,7 @@
           <w:p>
             <w:pPr>
               <w:spacing w:line="240" w:lineRule="auto"/>
+              <w:jc w:val="left"/>
             </w:pPr>
             <w:r>
               <w:rPr>
@@ -5115,6 +5299,7 @@
           <w:p>
             <w:pPr>
               <w:spacing w:line="240" w:lineRule="auto"/>
+              <w:jc w:val="left"/>
             </w:pPr>
             <w:r>
               <w:rPr>
@@ -5134,6 +5319,7 @@
           <w:p>
             <w:pPr>
               <w:spacing w:line="240" w:lineRule="auto"/>
+              <w:jc w:val="left"/>
             </w:pPr>
             <w:r>
               <w:rPr>
@@ -5350,7 +5536,7 @@
         <w:spacing w:line="360" w:lineRule="auto"/>
       </w:pPr>
       <w:r>
-        <w:t>1. **Первичная, или организационная адаптация.** Она связана с ознакомлением работника с особенностями управления, местом подразделения и должности в структуре компании, правилами внутреннего трудового распорядка и локальными документами.</w:t>
+        <w:t>1. Первичная, или организационная адаптация. Она связана с ознакомлением работника с особенностями управления, местом подразделения и должности в структуре компании, правилами внутреннего трудового распорядка и локальными документами.</w:t>
       </w:r>
     </w:p>
     <w:p>
@@ -5359,7 +5545,7 @@
         <w:spacing w:line="360" w:lineRule="auto"/>
       </w:pPr>
       <w:r>
-        <w:t>2. **Профессиональная адаптация.** Направлена на освоение профессиональных знаний, навыков, обязанностей, порядка взаимодействия с другими подразделениями и условий труда.</w:t>
+        <w:t>2. Профессиональная адаптация. Направлена на освоение профессиональных знаний, навыков, обязанностей, порядка взаимодействия с другими подразделениями и условий труда.</w:t>
       </w:r>
     </w:p>
     <w:p>
@@ -5368,7 +5554,7 @@
         <w:spacing w:line="360" w:lineRule="auto"/>
       </w:pPr>
       <w:r>
-        <w:t>3. **Социально-психологическая адаптация.** Связана с включением работника в коллектив, принятием норм общения, корпоративных ценностей, атмосферы сотрудничества и взаимопомощи.</w:t>
+        <w:t>3. Социально-психологическая адаптация. Связана с включением работника в коллектив, принятием норм общения, корпоративных ценностей, атмосферы сотрудничества и взаимопомощи.</w:t>
       </w:r>
     </w:p>
     <w:p>
@@ -5449,6 +5635,7 @@
           <w:p>
             <w:pPr>
               <w:spacing w:line="240" w:lineRule="auto"/>
+              <w:jc w:val="center"/>
             </w:pPr>
             <w:r>
               <w:rPr>
@@ -5469,6 +5656,7 @@
           <w:p>
             <w:pPr>
               <w:spacing w:line="240" w:lineRule="auto"/>
+              <w:jc w:val="center"/>
             </w:pPr>
             <w:r>
               <w:rPr>
@@ -5489,6 +5677,7 @@
           <w:p>
             <w:pPr>
               <w:spacing w:line="240" w:lineRule="auto"/>
+              <w:jc w:val="center"/>
             </w:pPr>
             <w:r>
               <w:rPr>
@@ -5510,6 +5699,7 @@
           <w:p>
             <w:pPr>
               <w:spacing w:line="240" w:lineRule="auto"/>
+              <w:jc w:val="left"/>
             </w:pPr>
             <w:r>
               <w:rPr>
@@ -5529,6 +5719,7 @@
           <w:p>
             <w:pPr>
               <w:spacing w:line="240" w:lineRule="auto"/>
+              <w:jc w:val="left"/>
             </w:pPr>
             <w:r>
               <w:rPr>
@@ -5548,6 +5739,7 @@
           <w:p>
             <w:pPr>
               <w:spacing w:line="240" w:lineRule="auto"/>
+              <w:jc w:val="left"/>
             </w:pPr>
             <w:r>
               <w:rPr>
@@ -5569,6 +5761,7 @@
           <w:p>
             <w:pPr>
               <w:spacing w:line="240" w:lineRule="auto"/>
+              <w:jc w:val="left"/>
             </w:pPr>
             <w:r>
               <w:rPr>
@@ -5588,6 +5781,7 @@
           <w:p>
             <w:pPr>
               <w:spacing w:line="240" w:lineRule="auto"/>
+              <w:jc w:val="left"/>
             </w:pPr>
             <w:r>
               <w:rPr>
@@ -5607,6 +5801,7 @@
           <w:p>
             <w:pPr>
               <w:spacing w:line="240" w:lineRule="auto"/>
+              <w:jc w:val="left"/>
             </w:pPr>
             <w:r>
               <w:rPr>
@@ -5628,6 +5823,7 @@
           <w:p>
             <w:pPr>
               <w:spacing w:line="240" w:lineRule="auto"/>
+              <w:jc w:val="left"/>
             </w:pPr>
             <w:r>
               <w:rPr>
@@ -5647,6 +5843,7 @@
           <w:p>
             <w:pPr>
               <w:spacing w:line="240" w:lineRule="auto"/>
+              <w:jc w:val="left"/>
             </w:pPr>
             <w:r>
               <w:rPr>
@@ -5666,6 +5863,7 @@
           <w:p>
             <w:pPr>
               <w:spacing w:line="240" w:lineRule="auto"/>
+              <w:jc w:val="left"/>
             </w:pPr>
             <w:r>
               <w:rPr>
@@ -5687,6 +5885,7 @@
           <w:p>
             <w:pPr>
               <w:spacing w:line="240" w:lineRule="auto"/>
+              <w:jc w:val="left"/>
             </w:pPr>
             <w:r>
               <w:rPr>
@@ -5706,6 +5905,7 @@
           <w:p>
             <w:pPr>
               <w:spacing w:line="240" w:lineRule="auto"/>
+              <w:jc w:val="left"/>
             </w:pPr>
             <w:r>
               <w:rPr>
@@ -5725,6 +5925,7 @@
           <w:p>
             <w:pPr>
               <w:spacing w:line="240" w:lineRule="auto"/>
+              <w:jc w:val="left"/>
             </w:pPr>
             <w:r>
               <w:rPr>
@@ -5746,6 +5947,7 @@
           <w:p>
             <w:pPr>
               <w:spacing w:line="240" w:lineRule="auto"/>
+              <w:jc w:val="left"/>
             </w:pPr>
             <w:r>
               <w:rPr>
@@ -5765,6 +5967,7 @@
           <w:p>
             <w:pPr>
               <w:spacing w:line="240" w:lineRule="auto"/>
+              <w:jc w:val="left"/>
             </w:pPr>
             <w:r>
               <w:rPr>
@@ -5784,6 +5987,7 @@
           <w:p>
             <w:pPr>
               <w:spacing w:line="240" w:lineRule="auto"/>
+              <w:jc w:val="left"/>
             </w:pPr>
             <w:r>
               <w:rPr>
@@ -5805,6 +6009,7 @@
           <w:p>
             <w:pPr>
               <w:spacing w:line="240" w:lineRule="auto"/>
+              <w:jc w:val="left"/>
             </w:pPr>
             <w:r>
               <w:rPr>
@@ -5824,6 +6029,7 @@
           <w:p>
             <w:pPr>
               <w:spacing w:line="240" w:lineRule="auto"/>
+              <w:jc w:val="left"/>
             </w:pPr>
             <w:r>
               <w:rPr>
@@ -5843,6 +6049,7 @@
           <w:p>
             <w:pPr>
               <w:spacing w:line="240" w:lineRule="auto"/>
+              <w:jc w:val="left"/>
             </w:pPr>
             <w:r>
               <w:rPr>
@@ -5864,6 +6071,7 @@
           <w:p>
             <w:pPr>
               <w:spacing w:line="240" w:lineRule="auto"/>
+              <w:jc w:val="left"/>
             </w:pPr>
             <w:r>
               <w:rPr>
@@ -5883,6 +6091,7 @@
           <w:p>
             <w:pPr>
               <w:spacing w:line="240" w:lineRule="auto"/>
+              <w:jc w:val="left"/>
             </w:pPr>
             <w:r>
               <w:rPr>
@@ -5902,6 +6111,7 @@
           <w:p>
             <w:pPr>
               <w:spacing w:line="240" w:lineRule="auto"/>
+              <w:jc w:val="left"/>
             </w:pPr>
             <w:r>
               <w:rPr>
@@ -5923,6 +6133,7 @@
           <w:p>
             <w:pPr>
               <w:spacing w:line="240" w:lineRule="auto"/>
+              <w:jc w:val="left"/>
             </w:pPr>
             <w:r>
               <w:rPr>
@@ -5942,6 +6153,7 @@
           <w:p>
             <w:pPr>
               <w:spacing w:line="240" w:lineRule="auto"/>
+              <w:jc w:val="left"/>
             </w:pPr>
             <w:r>
               <w:rPr>
@@ -5961,6 +6173,7 @@
           <w:p>
             <w:pPr>
               <w:spacing w:line="240" w:lineRule="auto"/>
+              <w:jc w:val="left"/>
             </w:pPr>
             <w:r>
               <w:rPr>
@@ -6214,7 +6427,7 @@
         <w:spacing w:line="360" w:lineRule="auto"/>
       </w:pPr>
       <w:r>
-        <w:t>**базовая оплата труда** - оклады, тарифные ставки, гарантированный доход;</w:t>
+        <w:t>базовая оплата труда - оклады, тарифные ставки, гарантированный доход;</w:t>
       </w:r>
     </w:p>
     <w:p>
@@ -6223,7 +6436,7 @@
         <w:spacing w:line="360" w:lineRule="auto"/>
       </w:pPr>
       <w:r>
-        <w:t>**премирование и стимулирующие выплаты** - связь вознаграждения с результатами труда;</w:t>
+        <w:t>премирование и стимулирующие выплаты - связь вознаграждения с результатами труда;</w:t>
       </w:r>
     </w:p>
     <w:p>
@@ -6232,7 +6445,7 @@
         <w:spacing w:line="360" w:lineRule="auto"/>
       </w:pPr>
       <w:r>
-        <w:t>**компенсационные выплаты** - доплаты и надбавки, связанные с условиями труда, режимом работы и дополнительными обязанностями;</w:t>
+        <w:t>компенсационные выплаты - доплаты и надбавки, связанные с условиями труда, режимом работы и дополнительными обязанностями;</w:t>
       </w:r>
     </w:p>
     <w:p>
@@ -6241,7 +6454,7 @@
         <w:spacing w:line="360" w:lineRule="auto"/>
       </w:pPr>
       <w:r>
-        <w:t>**социальные гарантии** - материальная помощь, компенсации, дополнительные дни отдыха, поддержка семей работников;</w:t>
+        <w:t>социальные гарантии - материальная помощь, компенсации, дополнительные дни отдыха, поддержка семей работников;</w:t>
       </w:r>
     </w:p>
     <w:p>
@@ -6250,7 +6463,7 @@
         <w:spacing w:line="360" w:lineRule="auto"/>
       </w:pPr>
       <w:r>
-        <w:t>**организационная мотивация** - стабильность занятости, понятные правила, регламенты, возможность внутреннего перемещения;</w:t>
+        <w:t>организационная мотивация - стабильность занятости, понятные правила, регламенты, возможность внутреннего перемещения;</w:t>
       </w:r>
     </w:p>
     <w:p>
@@ -6259,7 +6472,7 @@
         <w:spacing w:line="360" w:lineRule="auto"/>
       </w:pPr>
       <w:r>
-        <w:t>**профессиональная мотивация** - обучение, повышение квалификации, наставничество, участие в развитии компетенций;</w:t>
+        <w:t>профессиональная мотивация - обучение, повышение квалификации, наставничество, участие в развитии компетенций;</w:t>
       </w:r>
     </w:p>
     <w:p>
@@ -6268,7 +6481,7 @@
         <w:spacing w:line="360" w:lineRule="auto"/>
       </w:pPr>
       <w:r>
-        <w:t>**нематериальная мотивация** - признание, корпоративные традиции, участие в мероприятиях, благоприятный климат;</w:t>
+        <w:t>нематериальная мотивация - признание, корпоративные традиции, участие в мероприятиях, благоприятный климат;</w:t>
       </w:r>
     </w:p>
     <w:p>
@@ -6277,7 +6490,7 @@
         <w:spacing w:line="360" w:lineRule="auto"/>
       </w:pPr>
       <w:r>
-        <w:t>**мотивация через безопасность и условия труда** - охрана труда, нормальные рабочие места, обеспечение оборудованием;</w:t>
+        <w:t>мотивация через безопасность и условия труда - охрана труда, нормальные рабочие места, обеспечение оборудованием;</w:t>
       </w:r>
     </w:p>
     <w:p>
@@ -6286,7 +6499,7 @@
         <w:spacing w:line="360" w:lineRule="auto"/>
       </w:pPr>
       <w:r>
-        <w:t>**мотивация через социальное партнерство** - участие профсоюза, коллективный договор, консультации по социально-трудовым вопросам.</w:t>
+        <w:t>мотивация через социальное партнерство - участие профсоюза, коллективный договор, консультации по социально-трудовым вопросам.</w:t>
       </w:r>
     </w:p>
     <w:p>
@@ -6325,6 +6538,7 @@
           <w:p>
             <w:pPr>
               <w:spacing w:line="240" w:lineRule="auto"/>
+              <w:jc w:val="center"/>
             </w:pPr>
             <w:r>
               <w:rPr>
@@ -6345,6 +6559,7 @@
           <w:p>
             <w:pPr>
               <w:spacing w:line="240" w:lineRule="auto"/>
+              <w:jc w:val="center"/>
             </w:pPr>
             <w:r>
               <w:rPr>
@@ -6365,6 +6580,7 @@
           <w:p>
             <w:pPr>
               <w:spacing w:line="240" w:lineRule="auto"/>
+              <w:jc w:val="center"/>
             </w:pPr>
             <w:r>
               <w:rPr>
@@ -6386,6 +6602,7 @@
           <w:p>
             <w:pPr>
               <w:spacing w:line="240" w:lineRule="auto"/>
+              <w:jc w:val="left"/>
             </w:pPr>
             <w:r>
               <w:rPr>
@@ -6405,6 +6622,7 @@
           <w:p>
             <w:pPr>
               <w:spacing w:line="240" w:lineRule="auto"/>
+              <w:jc w:val="left"/>
             </w:pPr>
             <w:r>
               <w:rPr>
@@ -6424,6 +6642,7 @@
           <w:p>
             <w:pPr>
               <w:spacing w:line="240" w:lineRule="auto"/>
+              <w:jc w:val="left"/>
             </w:pPr>
             <w:r>
               <w:rPr>
@@ -6445,6 +6664,7 @@
           <w:p>
             <w:pPr>
               <w:spacing w:line="240" w:lineRule="auto"/>
+              <w:jc w:val="left"/>
             </w:pPr>
             <w:r>
               <w:rPr>
@@ -6464,6 +6684,7 @@
           <w:p>
             <w:pPr>
               <w:spacing w:line="240" w:lineRule="auto"/>
+              <w:jc w:val="left"/>
             </w:pPr>
             <w:r>
               <w:rPr>
@@ -6483,6 +6704,7 @@
           <w:p>
             <w:pPr>
               <w:spacing w:line="240" w:lineRule="auto"/>
+              <w:jc w:val="left"/>
             </w:pPr>
             <w:r>
               <w:rPr>
@@ -6504,6 +6726,7 @@
           <w:p>
             <w:pPr>
               <w:spacing w:line="240" w:lineRule="auto"/>
+              <w:jc w:val="left"/>
             </w:pPr>
             <w:r>
               <w:rPr>
@@ -6523,6 +6746,7 @@
           <w:p>
             <w:pPr>
               <w:spacing w:line="240" w:lineRule="auto"/>
+              <w:jc w:val="left"/>
             </w:pPr>
             <w:r>
               <w:rPr>
@@ -6542,6 +6766,7 @@
           <w:p>
             <w:pPr>
               <w:spacing w:line="240" w:lineRule="auto"/>
+              <w:jc w:val="left"/>
             </w:pPr>
             <w:r>
               <w:rPr>
@@ -6563,6 +6788,7 @@
           <w:p>
             <w:pPr>
               <w:spacing w:line="240" w:lineRule="auto"/>
+              <w:jc w:val="left"/>
             </w:pPr>
             <w:r>
               <w:rPr>
@@ -6582,6 +6808,7 @@
           <w:p>
             <w:pPr>
               <w:spacing w:line="240" w:lineRule="auto"/>
+              <w:jc w:val="left"/>
             </w:pPr>
             <w:r>
               <w:rPr>
@@ -6601,6 +6828,7 @@
           <w:p>
             <w:pPr>
               <w:spacing w:line="240" w:lineRule="auto"/>
+              <w:jc w:val="left"/>
             </w:pPr>
             <w:r>
               <w:rPr>
@@ -6622,6 +6850,7 @@
           <w:p>
             <w:pPr>
               <w:spacing w:line="240" w:lineRule="auto"/>
+              <w:jc w:val="left"/>
             </w:pPr>
             <w:r>
               <w:rPr>
@@ -6641,6 +6870,7 @@
           <w:p>
             <w:pPr>
               <w:spacing w:line="240" w:lineRule="auto"/>
+              <w:jc w:val="left"/>
             </w:pPr>
             <w:r>
               <w:rPr>
@@ -6660,6 +6890,7 @@
           <w:p>
             <w:pPr>
               <w:spacing w:line="240" w:lineRule="auto"/>
+              <w:jc w:val="left"/>
             </w:pPr>
             <w:r>
               <w:rPr>
@@ -6681,6 +6912,7 @@
           <w:p>
             <w:pPr>
               <w:spacing w:line="240" w:lineRule="auto"/>
+              <w:jc w:val="left"/>
             </w:pPr>
             <w:r>
               <w:rPr>
@@ -6700,6 +6932,7 @@
           <w:p>
             <w:pPr>
               <w:spacing w:line="240" w:lineRule="auto"/>
+              <w:jc w:val="left"/>
             </w:pPr>
             <w:r>
               <w:rPr>
@@ -6719,6 +6952,7 @@
           <w:p>
             <w:pPr>
               <w:spacing w:line="240" w:lineRule="auto"/>
+              <w:jc w:val="left"/>
             </w:pPr>
             <w:r>
               <w:rPr>
@@ -6825,6 +7059,7 @@
           <w:p>
             <w:pPr>
               <w:spacing w:line="240" w:lineRule="auto"/>
+              <w:jc w:val="center"/>
             </w:pPr>
             <w:r>
               <w:rPr>
@@ -6845,6 +7080,7 @@
           <w:p>
             <w:pPr>
               <w:spacing w:line="240" w:lineRule="auto"/>
+              <w:jc w:val="center"/>
             </w:pPr>
             <w:r>
               <w:rPr>
@@ -6865,6 +7101,7 @@
           <w:p>
             <w:pPr>
               <w:spacing w:line="240" w:lineRule="auto"/>
+              <w:jc w:val="center"/>
             </w:pPr>
             <w:r>
               <w:rPr>
@@ -6886,6 +7123,7 @@
           <w:p>
             <w:pPr>
               <w:spacing w:line="240" w:lineRule="auto"/>
+              <w:jc w:val="left"/>
             </w:pPr>
             <w:r>
               <w:rPr>
@@ -6905,6 +7143,7 @@
           <w:p>
             <w:pPr>
               <w:spacing w:line="240" w:lineRule="auto"/>
+              <w:jc w:val="left"/>
             </w:pPr>
             <w:r>
               <w:rPr>
@@ -6924,6 +7163,7 @@
           <w:p>
             <w:pPr>
               <w:spacing w:line="240" w:lineRule="auto"/>
+              <w:jc w:val="left"/>
             </w:pPr>
             <w:r>
               <w:rPr>
@@ -6945,6 +7185,7 @@
           <w:p>
             <w:pPr>
               <w:spacing w:line="240" w:lineRule="auto"/>
+              <w:jc w:val="left"/>
             </w:pPr>
             <w:r>
               <w:rPr>
@@ -6964,6 +7205,7 @@
           <w:p>
             <w:pPr>
               <w:spacing w:line="240" w:lineRule="auto"/>
+              <w:jc w:val="left"/>
             </w:pPr>
             <w:r>
               <w:rPr>
@@ -6983,6 +7225,7 @@
           <w:p>
             <w:pPr>
               <w:spacing w:line="240" w:lineRule="auto"/>
+              <w:jc w:val="left"/>
             </w:pPr>
             <w:r>
               <w:rPr>
@@ -7004,6 +7247,7 @@
           <w:p>
             <w:pPr>
               <w:spacing w:line="240" w:lineRule="auto"/>
+              <w:jc w:val="left"/>
             </w:pPr>
             <w:r>
               <w:rPr>
@@ -7023,6 +7267,7 @@
           <w:p>
             <w:pPr>
               <w:spacing w:line="240" w:lineRule="auto"/>
+              <w:jc w:val="left"/>
             </w:pPr>
             <w:r>
               <w:rPr>
@@ -7042,6 +7287,7 @@
           <w:p>
             <w:pPr>
               <w:spacing w:line="240" w:lineRule="auto"/>
+              <w:jc w:val="left"/>
             </w:pPr>
             <w:r>
               <w:rPr>
@@ -7063,6 +7309,7 @@
           <w:p>
             <w:pPr>
               <w:spacing w:line="240" w:lineRule="auto"/>
+              <w:jc w:val="left"/>
             </w:pPr>
             <w:r>
               <w:rPr>
@@ -7082,6 +7329,7 @@
           <w:p>
             <w:pPr>
               <w:spacing w:line="240" w:lineRule="auto"/>
+              <w:jc w:val="left"/>
             </w:pPr>
             <w:r>
               <w:rPr>
@@ -7101,6 +7349,7 @@
           <w:p>
             <w:pPr>
               <w:spacing w:line="240" w:lineRule="auto"/>
+              <w:jc w:val="left"/>
             </w:pPr>
             <w:r>
               <w:rPr>
@@ -7122,6 +7371,7 @@
           <w:p>
             <w:pPr>
               <w:spacing w:line="240" w:lineRule="auto"/>
+              <w:jc w:val="left"/>
             </w:pPr>
             <w:r>
               <w:rPr>
@@ -7141,6 +7391,7 @@
           <w:p>
             <w:pPr>
               <w:spacing w:line="240" w:lineRule="auto"/>
+              <w:jc w:val="left"/>
             </w:pPr>
             <w:r>
               <w:rPr>
@@ -7160,6 +7411,7 @@
           <w:p>
             <w:pPr>
               <w:spacing w:line="240" w:lineRule="auto"/>
+              <w:jc w:val="left"/>
             </w:pPr>
             <w:r>
               <w:rPr>
@@ -7181,6 +7433,7 @@
           <w:p>
             <w:pPr>
               <w:spacing w:line="240" w:lineRule="auto"/>
+              <w:jc w:val="left"/>
             </w:pPr>
             <w:r>
               <w:rPr>
@@ -7200,6 +7453,7 @@
           <w:p>
             <w:pPr>
               <w:spacing w:line="240" w:lineRule="auto"/>
+              <w:jc w:val="left"/>
             </w:pPr>
             <w:r>
               <w:rPr>
@@ -7219,6 +7473,7 @@
           <w:p>
             <w:pPr>
               <w:spacing w:line="240" w:lineRule="auto"/>
+              <w:jc w:val="left"/>
             </w:pPr>
             <w:r>
               <w:rPr>
@@ -7240,6 +7495,7 @@
           <w:p>
             <w:pPr>
               <w:spacing w:line="240" w:lineRule="auto"/>
+              <w:jc w:val="left"/>
             </w:pPr>
             <w:r>
               <w:rPr>
@@ -7259,6 +7515,7 @@
           <w:p>
             <w:pPr>
               <w:spacing w:line="240" w:lineRule="auto"/>
+              <w:jc w:val="left"/>
             </w:pPr>
             <w:r>
               <w:rPr>
@@ -7278,6 +7535,7 @@
           <w:p>
             <w:pPr>
               <w:spacing w:line="240" w:lineRule="auto"/>
+              <w:jc w:val="left"/>
             </w:pPr>
             <w:r>
               <w:rPr>
@@ -7484,6 +7742,7 @@
           <w:p>
             <w:pPr>
               <w:spacing w:line="240" w:lineRule="auto"/>
+              <w:jc w:val="center"/>
             </w:pPr>
             <w:r>
               <w:rPr>
@@ -7504,6 +7763,7 @@
           <w:p>
             <w:pPr>
               <w:spacing w:line="240" w:lineRule="auto"/>
+              <w:jc w:val="center"/>
             </w:pPr>
             <w:r>
               <w:rPr>
@@ -7524,6 +7784,7 @@
           <w:p>
             <w:pPr>
               <w:spacing w:line="240" w:lineRule="auto"/>
+              <w:jc w:val="center"/>
             </w:pPr>
             <w:r>
               <w:rPr>
@@ -7545,6 +7806,7 @@
           <w:p>
             <w:pPr>
               <w:spacing w:line="240" w:lineRule="auto"/>
+              <w:jc w:val="left"/>
             </w:pPr>
             <w:r>
               <w:rPr>
@@ -7564,6 +7826,7 @@
           <w:p>
             <w:pPr>
               <w:spacing w:line="240" w:lineRule="auto"/>
+              <w:jc w:val="left"/>
             </w:pPr>
             <w:r>
               <w:rPr>
@@ -7583,6 +7846,7 @@
           <w:p>
             <w:pPr>
               <w:spacing w:line="240" w:lineRule="auto"/>
+              <w:jc w:val="left"/>
             </w:pPr>
             <w:r>
               <w:rPr>
@@ -7604,6 +7868,7 @@
           <w:p>
             <w:pPr>
               <w:spacing w:line="240" w:lineRule="auto"/>
+              <w:jc w:val="left"/>
             </w:pPr>
             <w:r>
               <w:rPr>
@@ -7623,6 +7888,7 @@
           <w:p>
             <w:pPr>
               <w:spacing w:line="240" w:lineRule="auto"/>
+              <w:jc w:val="left"/>
             </w:pPr>
             <w:r>
               <w:rPr>
@@ -7642,6 +7908,7 @@
           <w:p>
             <w:pPr>
               <w:spacing w:line="240" w:lineRule="auto"/>
+              <w:jc w:val="left"/>
             </w:pPr>
             <w:r>
               <w:rPr>
@@ -7663,6 +7930,7 @@
           <w:p>
             <w:pPr>
               <w:spacing w:line="240" w:lineRule="auto"/>
+              <w:jc w:val="left"/>
             </w:pPr>
             <w:r>
               <w:rPr>
@@ -7682,6 +7950,7 @@
           <w:p>
             <w:pPr>
               <w:spacing w:line="240" w:lineRule="auto"/>
+              <w:jc w:val="left"/>
             </w:pPr>
             <w:r>
               <w:rPr>
@@ -7701,6 +7970,7 @@
           <w:p>
             <w:pPr>
               <w:spacing w:line="240" w:lineRule="auto"/>
+              <w:jc w:val="left"/>
             </w:pPr>
             <w:r>
               <w:rPr>
@@ -7722,6 +7992,7 @@
           <w:p>
             <w:pPr>
               <w:spacing w:line="240" w:lineRule="auto"/>
+              <w:jc w:val="left"/>
             </w:pPr>
             <w:r>
               <w:rPr>
@@ -7741,6 +8012,7 @@
           <w:p>
             <w:pPr>
               <w:spacing w:line="240" w:lineRule="auto"/>
+              <w:jc w:val="left"/>
             </w:pPr>
             <w:r>
               <w:rPr>
@@ -7760,6 +8032,7 @@
           <w:p>
             <w:pPr>
               <w:spacing w:line="240" w:lineRule="auto"/>
+              <w:jc w:val="left"/>
             </w:pPr>
             <w:r>
               <w:rPr>
@@ -7781,6 +8054,7 @@
           <w:p>
             <w:pPr>
               <w:spacing w:line="240" w:lineRule="auto"/>
+              <w:jc w:val="left"/>
             </w:pPr>
             <w:r>
               <w:rPr>
@@ -7800,6 +8074,7 @@
           <w:p>
             <w:pPr>
               <w:spacing w:line="240" w:lineRule="auto"/>
+              <w:jc w:val="left"/>
             </w:pPr>
             <w:r>
               <w:rPr>
@@ -7819,6 +8094,7 @@
           <w:p>
             <w:pPr>
               <w:spacing w:line="240" w:lineRule="auto"/>
+              <w:jc w:val="left"/>
             </w:pPr>
             <w:r>
               <w:rPr>
@@ -7840,6 +8116,7 @@
           <w:p>
             <w:pPr>
               <w:spacing w:line="240" w:lineRule="auto"/>
+              <w:jc w:val="left"/>
             </w:pPr>
             <w:r>
               <w:rPr>
@@ -7859,6 +8136,7 @@
           <w:p>
             <w:pPr>
               <w:spacing w:line="240" w:lineRule="auto"/>
+              <w:jc w:val="left"/>
             </w:pPr>
             <w:r>
               <w:rPr>
@@ -7878,6 +8156,7 @@
           <w:p>
             <w:pPr>
               <w:spacing w:line="240" w:lineRule="auto"/>
+              <w:jc w:val="left"/>
             </w:pPr>
             <w:r>
               <w:rPr>
@@ -7899,6 +8178,7 @@
           <w:p>
             <w:pPr>
               <w:spacing w:line="240" w:lineRule="auto"/>
+              <w:jc w:val="left"/>
             </w:pPr>
             <w:r>
               <w:rPr>
@@ -7918,6 +8198,7 @@
           <w:p>
             <w:pPr>
               <w:spacing w:line="240" w:lineRule="auto"/>
+              <w:jc w:val="left"/>
             </w:pPr>
             <w:r>
               <w:rPr>
@@ -7937,6 +8218,7 @@
           <w:p>
             <w:pPr>
               <w:spacing w:line="240" w:lineRule="auto"/>
+              <w:jc w:val="left"/>
             </w:pPr>
             <w:r>
               <w:rPr>
@@ -8228,6 +8510,7 @@
           <w:p>
             <w:pPr>
               <w:spacing w:line="240" w:lineRule="auto"/>
+              <w:jc w:val="center"/>
             </w:pPr>
             <w:r>
               <w:rPr>
@@ -8248,6 +8531,7 @@
           <w:p>
             <w:pPr>
               <w:spacing w:line="240" w:lineRule="auto"/>
+              <w:jc w:val="center"/>
             </w:pPr>
             <w:r>
               <w:rPr>
@@ -8268,6 +8552,7 @@
           <w:p>
             <w:pPr>
               <w:spacing w:line="240" w:lineRule="auto"/>
+              <w:jc w:val="center"/>
             </w:pPr>
             <w:r>
               <w:rPr>
@@ -8289,6 +8574,7 @@
           <w:p>
             <w:pPr>
               <w:spacing w:line="240" w:lineRule="auto"/>
+              <w:jc w:val="left"/>
             </w:pPr>
             <w:r>
               <w:rPr>
@@ -8308,6 +8594,7 @@
           <w:p>
             <w:pPr>
               <w:spacing w:line="240" w:lineRule="auto"/>
+              <w:jc w:val="left"/>
             </w:pPr>
             <w:r>
               <w:rPr>
@@ -8327,6 +8614,7 @@
           <w:p>
             <w:pPr>
               <w:spacing w:line="240" w:lineRule="auto"/>
+              <w:jc w:val="left"/>
             </w:pPr>
             <w:r>
               <w:rPr>
@@ -8348,6 +8636,7 @@
           <w:p>
             <w:pPr>
               <w:spacing w:line="240" w:lineRule="auto"/>
+              <w:jc w:val="left"/>
             </w:pPr>
             <w:r>
               <w:rPr>
@@ -8367,6 +8656,7 @@
           <w:p>
             <w:pPr>
               <w:spacing w:line="240" w:lineRule="auto"/>
+              <w:jc w:val="left"/>
             </w:pPr>
             <w:r>
               <w:rPr>
@@ -8386,6 +8676,7 @@
           <w:p>
             <w:pPr>
               <w:spacing w:line="240" w:lineRule="auto"/>
+              <w:jc w:val="left"/>
             </w:pPr>
             <w:r>
               <w:rPr>
@@ -8407,6 +8698,7 @@
           <w:p>
             <w:pPr>
               <w:spacing w:line="240" w:lineRule="auto"/>
+              <w:jc w:val="left"/>
             </w:pPr>
             <w:r>
               <w:rPr>
@@ -8426,6 +8718,7 @@
           <w:p>
             <w:pPr>
               <w:spacing w:line="240" w:lineRule="auto"/>
+              <w:jc w:val="left"/>
             </w:pPr>
             <w:r>
               <w:rPr>
@@ -8445,6 +8738,7 @@
           <w:p>
             <w:pPr>
               <w:spacing w:line="240" w:lineRule="auto"/>
+              <w:jc w:val="left"/>
             </w:pPr>
             <w:r>
               <w:rPr>
@@ -8466,6 +8760,7 @@
           <w:p>
             <w:pPr>
               <w:spacing w:line="240" w:lineRule="auto"/>
+              <w:jc w:val="left"/>
             </w:pPr>
             <w:r>
               <w:rPr>
@@ -8485,6 +8780,7 @@
           <w:p>
             <w:pPr>
               <w:spacing w:line="240" w:lineRule="auto"/>
+              <w:jc w:val="left"/>
             </w:pPr>
             <w:r>
               <w:rPr>
@@ -8504,6 +8800,7 @@
           <w:p>
             <w:pPr>
               <w:spacing w:line="240" w:lineRule="auto"/>
+              <w:jc w:val="left"/>
             </w:pPr>
             <w:r>
               <w:rPr>
@@ -8525,6 +8822,7 @@
           <w:p>
             <w:pPr>
               <w:spacing w:line="240" w:lineRule="auto"/>
+              <w:jc w:val="left"/>
             </w:pPr>
             <w:r>
               <w:rPr>
@@ -8544,6 +8842,7 @@
           <w:p>
             <w:pPr>
               <w:spacing w:line="240" w:lineRule="auto"/>
+              <w:jc w:val="left"/>
             </w:pPr>
             <w:r>
               <w:rPr>
@@ -8563,6 +8862,7 @@
           <w:p>
             <w:pPr>
               <w:spacing w:line="240" w:lineRule="auto"/>
+              <w:jc w:val="left"/>
             </w:pPr>
             <w:r>
               <w:rPr>
@@ -8831,6 +9131,7 @@
           <w:p>
             <w:pPr>
               <w:spacing w:line="240" w:lineRule="auto"/>
+              <w:jc w:val="center"/>
             </w:pPr>
             <w:r>
               <w:rPr>
@@ -8851,6 +9152,7 @@
           <w:p>
             <w:pPr>
               <w:spacing w:line="240" w:lineRule="auto"/>
+              <w:jc w:val="center"/>
             </w:pPr>
             <w:r>
               <w:rPr>
@@ -8871,6 +9173,7 @@
           <w:p>
             <w:pPr>
               <w:spacing w:line="240" w:lineRule="auto"/>
+              <w:jc w:val="center"/>
             </w:pPr>
             <w:r>
               <w:rPr>
@@ -8892,6 +9195,7 @@
           <w:p>
             <w:pPr>
               <w:spacing w:line="240" w:lineRule="auto"/>
+              <w:jc w:val="left"/>
             </w:pPr>
             <w:r>
               <w:rPr>
@@ -8911,6 +9215,7 @@
           <w:p>
             <w:pPr>
               <w:spacing w:line="240" w:lineRule="auto"/>
+              <w:jc w:val="left"/>
             </w:pPr>
             <w:r>
               <w:rPr>
@@ -8930,6 +9235,7 @@
           <w:p>
             <w:pPr>
               <w:spacing w:line="240" w:lineRule="auto"/>
+              <w:jc w:val="left"/>
             </w:pPr>
             <w:r>
               <w:rPr>
@@ -8951,6 +9257,7 @@
           <w:p>
             <w:pPr>
               <w:spacing w:line="240" w:lineRule="auto"/>
+              <w:jc w:val="left"/>
             </w:pPr>
             <w:r>
               <w:rPr>
@@ -8970,6 +9277,7 @@
           <w:p>
             <w:pPr>
               <w:spacing w:line="240" w:lineRule="auto"/>
+              <w:jc w:val="left"/>
             </w:pPr>
             <w:r>
               <w:rPr>
@@ -8989,6 +9297,7 @@
           <w:p>
             <w:pPr>
               <w:spacing w:line="240" w:lineRule="auto"/>
+              <w:jc w:val="left"/>
             </w:pPr>
             <w:r>
               <w:rPr>
@@ -9010,6 +9319,7 @@
           <w:p>
             <w:pPr>
               <w:spacing w:line="240" w:lineRule="auto"/>
+              <w:jc w:val="left"/>
             </w:pPr>
             <w:r>
               <w:rPr>
@@ -9029,6 +9339,7 @@
           <w:p>
             <w:pPr>
               <w:spacing w:line="240" w:lineRule="auto"/>
+              <w:jc w:val="left"/>
             </w:pPr>
             <w:r>
               <w:rPr>
@@ -9048,6 +9359,7 @@
           <w:p>
             <w:pPr>
               <w:spacing w:line="240" w:lineRule="auto"/>
+              <w:jc w:val="left"/>
             </w:pPr>
             <w:r>
               <w:rPr>
@@ -9069,6 +9381,7 @@
           <w:p>
             <w:pPr>
               <w:spacing w:line="240" w:lineRule="auto"/>
+              <w:jc w:val="left"/>
             </w:pPr>
             <w:r>
               <w:rPr>
@@ -9088,6 +9401,7 @@
           <w:p>
             <w:pPr>
               <w:spacing w:line="240" w:lineRule="auto"/>
+              <w:jc w:val="left"/>
             </w:pPr>
             <w:r>
               <w:rPr>
@@ -9107,6 +9421,7 @@
           <w:p>
             <w:pPr>
               <w:spacing w:line="240" w:lineRule="auto"/>
+              <w:jc w:val="left"/>
             </w:pPr>
             <w:r>
               <w:rPr>
@@ -9128,6 +9443,7 @@
           <w:p>
             <w:pPr>
               <w:spacing w:line="240" w:lineRule="auto"/>
+              <w:jc w:val="left"/>
             </w:pPr>
             <w:r>
               <w:rPr>
@@ -9147,6 +9463,7 @@
           <w:p>
             <w:pPr>
               <w:spacing w:line="240" w:lineRule="auto"/>
+              <w:jc w:val="left"/>
             </w:pPr>
             <w:r>
               <w:rPr>
@@ -9166,6 +9483,7 @@
           <w:p>
             <w:pPr>
               <w:spacing w:line="240" w:lineRule="auto"/>
+              <w:jc w:val="left"/>
             </w:pPr>
             <w:r>
               <w:rPr>
@@ -9187,6 +9505,7 @@
           <w:p>
             <w:pPr>
               <w:spacing w:line="240" w:lineRule="auto"/>
+              <w:jc w:val="left"/>
             </w:pPr>
             <w:r>
               <w:rPr>
@@ -9206,6 +9525,7 @@
           <w:p>
             <w:pPr>
               <w:spacing w:line="240" w:lineRule="auto"/>
+              <w:jc w:val="left"/>
             </w:pPr>
             <w:r>
               <w:rPr>
@@ -9225,6 +9545,7 @@
           <w:p>
             <w:pPr>
               <w:spacing w:line="240" w:lineRule="auto"/>
+              <w:jc w:val="left"/>
             </w:pPr>
             <w:r>
               <w:rPr>
@@ -9246,6 +9567,7 @@
           <w:p>
             <w:pPr>
               <w:spacing w:line="240" w:lineRule="auto"/>
+              <w:jc w:val="left"/>
             </w:pPr>
             <w:r>
               <w:rPr>
@@ -9265,6 +9587,7 @@
           <w:p>
             <w:pPr>
               <w:spacing w:line="240" w:lineRule="auto"/>
+              <w:jc w:val="left"/>
             </w:pPr>
             <w:r>
               <w:rPr>
@@ -9284,6 +9607,7 @@
           <w:p>
             <w:pPr>
               <w:spacing w:line="240" w:lineRule="auto"/>
+              <w:jc w:val="left"/>
             </w:pPr>
             <w:r>
               <w:rPr>
@@ -9623,6 +9947,7 @@
           <w:p>
             <w:pPr>
               <w:spacing w:line="240" w:lineRule="auto"/>
+              <w:jc w:val="center"/>
             </w:pPr>
             <w:r>
               <w:rPr>
@@ -9643,6 +9968,7 @@
           <w:p>
             <w:pPr>
               <w:spacing w:line="240" w:lineRule="auto"/>
+              <w:jc w:val="center"/>
             </w:pPr>
             <w:r>
               <w:rPr>
@@ -9663,6 +9989,7 @@
           <w:p>
             <w:pPr>
               <w:spacing w:line="240" w:lineRule="auto"/>
+              <w:jc w:val="center"/>
             </w:pPr>
             <w:r>
               <w:rPr>
@@ -9684,6 +10011,7 @@
           <w:p>
             <w:pPr>
               <w:spacing w:line="240" w:lineRule="auto"/>
+              <w:jc w:val="left"/>
             </w:pPr>
             <w:r>
               <w:rPr>
@@ -9703,6 +10031,7 @@
           <w:p>
             <w:pPr>
               <w:spacing w:line="240" w:lineRule="auto"/>
+              <w:jc w:val="left"/>
             </w:pPr>
             <w:r>
               <w:rPr>
@@ -9722,6 +10051,7 @@
           <w:p>
             <w:pPr>
               <w:spacing w:line="240" w:lineRule="auto"/>
+              <w:jc w:val="left"/>
             </w:pPr>
             <w:r>
               <w:rPr>
@@ -9743,6 +10073,7 @@
           <w:p>
             <w:pPr>
               <w:spacing w:line="240" w:lineRule="auto"/>
+              <w:jc w:val="left"/>
             </w:pPr>
             <w:r>
               <w:rPr>
@@ -9762,6 +10093,7 @@
           <w:p>
             <w:pPr>
               <w:spacing w:line="240" w:lineRule="auto"/>
+              <w:jc w:val="left"/>
             </w:pPr>
             <w:r>
               <w:rPr>
@@ -9781,6 +10113,7 @@
           <w:p>
             <w:pPr>
               <w:spacing w:line="240" w:lineRule="auto"/>
+              <w:jc w:val="left"/>
             </w:pPr>
             <w:r>
               <w:rPr>
@@ -9802,6 +10135,7 @@
           <w:p>
             <w:pPr>
               <w:spacing w:line="240" w:lineRule="auto"/>
+              <w:jc w:val="left"/>
             </w:pPr>
             <w:r>
               <w:rPr>
@@ -9821,6 +10155,7 @@
           <w:p>
             <w:pPr>
               <w:spacing w:line="240" w:lineRule="auto"/>
+              <w:jc w:val="left"/>
             </w:pPr>
             <w:r>
               <w:rPr>
@@ -9840,6 +10175,7 @@
           <w:p>
             <w:pPr>
               <w:spacing w:line="240" w:lineRule="auto"/>
+              <w:jc w:val="left"/>
             </w:pPr>
             <w:r>
               <w:rPr>
@@ -9861,6 +10197,7 @@
           <w:p>
             <w:pPr>
               <w:spacing w:line="240" w:lineRule="auto"/>
+              <w:jc w:val="left"/>
             </w:pPr>
             <w:r>
               <w:rPr>
@@ -9880,6 +10217,7 @@
           <w:p>
             <w:pPr>
               <w:spacing w:line="240" w:lineRule="auto"/>
+              <w:jc w:val="left"/>
             </w:pPr>
             <w:r>
               <w:rPr>
@@ -9899,6 +10237,7 @@
           <w:p>
             <w:pPr>
               <w:spacing w:line="240" w:lineRule="auto"/>
+              <w:jc w:val="left"/>
             </w:pPr>
             <w:r>
               <w:rPr>
@@ -9920,6 +10259,7 @@
           <w:p>
             <w:pPr>
               <w:spacing w:line="240" w:lineRule="auto"/>
+              <w:jc w:val="left"/>
             </w:pPr>
             <w:r>
               <w:rPr>
@@ -9939,6 +10279,7 @@
           <w:p>
             <w:pPr>
               <w:spacing w:line="240" w:lineRule="auto"/>
+              <w:jc w:val="left"/>
             </w:pPr>
             <w:r>
               <w:rPr>
@@ -9958,6 +10299,7 @@
           <w:p>
             <w:pPr>
               <w:spacing w:line="240" w:lineRule="auto"/>
+              <w:jc w:val="left"/>
             </w:pPr>
             <w:r>
               <w:rPr>
@@ -9979,6 +10321,7 @@
           <w:p>
             <w:pPr>
               <w:spacing w:line="240" w:lineRule="auto"/>
+              <w:jc w:val="left"/>
             </w:pPr>
             <w:r>
               <w:rPr>
@@ -9998,6 +10341,7 @@
           <w:p>
             <w:pPr>
               <w:spacing w:line="240" w:lineRule="auto"/>
+              <w:jc w:val="left"/>
             </w:pPr>
             <w:r>
               <w:rPr>
@@ -10017,6 +10361,7 @@
           <w:p>
             <w:pPr>
               <w:spacing w:line="240" w:lineRule="auto"/>
+              <w:jc w:val="left"/>
             </w:pPr>
             <w:r>
               <w:rPr>
@@ -10038,6 +10383,7 @@
           <w:p>
             <w:pPr>
               <w:spacing w:line="240" w:lineRule="auto"/>
+              <w:jc w:val="left"/>
             </w:pPr>
             <w:r>
               <w:rPr>
@@ -10057,6 +10403,7 @@
           <w:p>
             <w:pPr>
               <w:spacing w:line="240" w:lineRule="auto"/>
+              <w:jc w:val="left"/>
             </w:pPr>
             <w:r>
               <w:rPr>
@@ -10076,6 +10423,7 @@
           <w:p>
             <w:pPr>
               <w:spacing w:line="240" w:lineRule="auto"/>
+              <w:jc w:val="left"/>
             </w:pPr>
             <w:r>
               <w:rPr>
@@ -10322,6 +10670,7 @@
           <w:p>
             <w:pPr>
               <w:spacing w:line="240" w:lineRule="auto"/>
+              <w:jc w:val="center"/>
             </w:pPr>
             <w:r>
               <w:rPr>
@@ -10342,6 +10691,7 @@
           <w:p>
             <w:pPr>
               <w:spacing w:line="240" w:lineRule="auto"/>
+              <w:jc w:val="center"/>
             </w:pPr>
             <w:r>
               <w:rPr>
@@ -10362,6 +10712,7 @@
           <w:p>
             <w:pPr>
               <w:spacing w:line="240" w:lineRule="auto"/>
+              <w:jc w:val="center"/>
             </w:pPr>
             <w:r>
               <w:rPr>
@@ -10383,6 +10734,7 @@
           <w:p>
             <w:pPr>
               <w:spacing w:line="240" w:lineRule="auto"/>
+              <w:jc w:val="left"/>
             </w:pPr>
             <w:r>
               <w:rPr>
@@ -10402,6 +10754,7 @@
           <w:p>
             <w:pPr>
               <w:spacing w:line="240" w:lineRule="auto"/>
+              <w:jc w:val="left"/>
             </w:pPr>
             <w:r>
               <w:rPr>
@@ -10421,6 +10774,7 @@
           <w:p>
             <w:pPr>
               <w:spacing w:line="240" w:lineRule="auto"/>
+              <w:jc w:val="left"/>
             </w:pPr>
             <w:r>
               <w:rPr>
@@ -10442,6 +10796,7 @@
           <w:p>
             <w:pPr>
               <w:spacing w:line="240" w:lineRule="auto"/>
+              <w:jc w:val="left"/>
             </w:pPr>
             <w:r>
               <w:rPr>
@@ -10461,6 +10816,7 @@
           <w:p>
             <w:pPr>
               <w:spacing w:line="240" w:lineRule="auto"/>
+              <w:jc w:val="left"/>
             </w:pPr>
             <w:r>
               <w:rPr>
@@ -10480,6 +10836,7 @@
           <w:p>
             <w:pPr>
               <w:spacing w:line="240" w:lineRule="auto"/>
+              <w:jc w:val="left"/>
             </w:pPr>
             <w:r>
               <w:rPr>
@@ -10501,6 +10858,7 @@
           <w:p>
             <w:pPr>
               <w:spacing w:line="240" w:lineRule="auto"/>
+              <w:jc w:val="left"/>
             </w:pPr>
             <w:r>
               <w:rPr>
@@ -10520,6 +10878,7 @@
           <w:p>
             <w:pPr>
               <w:spacing w:line="240" w:lineRule="auto"/>
+              <w:jc w:val="left"/>
             </w:pPr>
             <w:r>
               <w:rPr>
@@ -10539,6 +10898,7 @@
           <w:p>
             <w:pPr>
               <w:spacing w:line="240" w:lineRule="auto"/>
+              <w:jc w:val="left"/>
             </w:pPr>
             <w:r>
               <w:rPr>
@@ -10560,6 +10920,7 @@
           <w:p>
             <w:pPr>
               <w:spacing w:line="240" w:lineRule="auto"/>
+              <w:jc w:val="left"/>
             </w:pPr>
             <w:r>
               <w:rPr>
@@ -10579,6 +10940,7 @@
           <w:p>
             <w:pPr>
               <w:spacing w:line="240" w:lineRule="auto"/>
+              <w:jc w:val="left"/>
             </w:pPr>
             <w:r>
               <w:rPr>
@@ -10598,6 +10960,7 @@
           <w:p>
             <w:pPr>
               <w:spacing w:line="240" w:lineRule="auto"/>
+              <w:jc w:val="left"/>
             </w:pPr>
             <w:r>
               <w:rPr>
@@ -10619,6 +10982,7 @@
           <w:p>
             <w:pPr>
               <w:spacing w:line="240" w:lineRule="auto"/>
+              <w:jc w:val="left"/>
             </w:pPr>
             <w:r>
               <w:rPr>
@@ -10638,6 +11002,7 @@
           <w:p>
             <w:pPr>
               <w:spacing w:line="240" w:lineRule="auto"/>
+              <w:jc w:val="left"/>
             </w:pPr>
             <w:r>
               <w:rPr>
@@ -10657,6 +11022,7 @@
           <w:p>
             <w:pPr>
               <w:spacing w:line="240" w:lineRule="auto"/>
+              <w:jc w:val="left"/>
             </w:pPr>
             <w:r>
               <w:rPr>
@@ -10678,6 +11044,7 @@
           <w:p>
             <w:pPr>
               <w:spacing w:line="240" w:lineRule="auto"/>
+              <w:jc w:val="left"/>
             </w:pPr>
             <w:r>
               <w:rPr>
@@ -10697,6 +11064,7 @@
           <w:p>
             <w:pPr>
               <w:spacing w:line="240" w:lineRule="auto"/>
+              <w:jc w:val="left"/>
             </w:pPr>
             <w:r>
               <w:rPr>
@@ -10716,6 +11084,7 @@
           <w:p>
             <w:pPr>
               <w:spacing w:line="240" w:lineRule="auto"/>
+              <w:jc w:val="left"/>
             </w:pPr>
             <w:r>
               <w:rPr>
@@ -10737,6 +11106,7 @@
           <w:p>
             <w:pPr>
               <w:spacing w:line="240" w:lineRule="auto"/>
+              <w:jc w:val="left"/>
             </w:pPr>
             <w:r>
               <w:rPr>
@@ -10756,6 +11126,7 @@
           <w:p>
             <w:pPr>
               <w:spacing w:line="240" w:lineRule="auto"/>
+              <w:jc w:val="left"/>
             </w:pPr>
             <w:r>
               <w:rPr>
@@ -10775,6 +11146,7 @@
           <w:p>
             <w:pPr>
               <w:spacing w:line="240" w:lineRule="auto"/>
+              <w:jc w:val="left"/>
             </w:pPr>
             <w:r>
               <w:rPr>
@@ -10973,6 +11345,7 @@
           <w:p>
             <w:pPr>
               <w:spacing w:line="240" w:lineRule="auto"/>
+              <w:jc w:val="center"/>
             </w:pPr>
             <w:r>
               <w:rPr>
@@ -10993,6 +11366,7 @@
           <w:p>
             <w:pPr>
               <w:spacing w:line="240" w:lineRule="auto"/>
+              <w:jc w:val="center"/>
             </w:pPr>
             <w:r>
               <w:rPr>
@@ -11013,6 +11387,7 @@
           <w:p>
             <w:pPr>
               <w:spacing w:line="240" w:lineRule="auto"/>
+              <w:jc w:val="center"/>
             </w:pPr>
             <w:r>
               <w:rPr>
@@ -11034,6 +11409,7 @@
           <w:p>
             <w:pPr>
               <w:spacing w:line="240" w:lineRule="auto"/>
+              <w:jc w:val="left"/>
             </w:pPr>
             <w:r>
               <w:rPr>
@@ -11053,6 +11429,7 @@
           <w:p>
             <w:pPr>
               <w:spacing w:line="240" w:lineRule="auto"/>
+              <w:jc w:val="left"/>
             </w:pPr>
             <w:r>
               <w:rPr>
@@ -11072,6 +11449,7 @@
           <w:p>
             <w:pPr>
               <w:spacing w:line="240" w:lineRule="auto"/>
+              <w:jc w:val="left"/>
             </w:pPr>
             <w:r>
               <w:rPr>
@@ -11093,6 +11471,7 @@
           <w:p>
             <w:pPr>
               <w:spacing w:line="240" w:lineRule="auto"/>
+              <w:jc w:val="left"/>
             </w:pPr>
             <w:r>
               <w:rPr>
@@ -11112,6 +11491,7 @@
           <w:p>
             <w:pPr>
               <w:spacing w:line="240" w:lineRule="auto"/>
+              <w:jc w:val="left"/>
             </w:pPr>
             <w:r>
               <w:rPr>
@@ -11131,6 +11511,7 @@
           <w:p>
             <w:pPr>
               <w:spacing w:line="240" w:lineRule="auto"/>
+              <w:jc w:val="left"/>
             </w:pPr>
             <w:r>
               <w:rPr>
@@ -11152,6 +11533,7 @@
           <w:p>
             <w:pPr>
               <w:spacing w:line="240" w:lineRule="auto"/>
+              <w:jc w:val="left"/>
             </w:pPr>
             <w:r>
               <w:rPr>
@@ -11171,6 +11553,7 @@
           <w:p>
             <w:pPr>
               <w:spacing w:line="240" w:lineRule="auto"/>
+              <w:jc w:val="left"/>
             </w:pPr>
             <w:r>
               <w:rPr>
@@ -11190,6 +11573,7 @@
           <w:p>
             <w:pPr>
               <w:spacing w:line="240" w:lineRule="auto"/>
+              <w:jc w:val="left"/>
             </w:pPr>
             <w:r>
               <w:rPr>
@@ -11211,6 +11595,7 @@
           <w:p>
             <w:pPr>
               <w:spacing w:line="240" w:lineRule="auto"/>
+              <w:jc w:val="left"/>
             </w:pPr>
             <w:r>
               <w:rPr>
@@ -11230,6 +11615,7 @@
           <w:p>
             <w:pPr>
               <w:spacing w:line="240" w:lineRule="auto"/>
+              <w:jc w:val="left"/>
             </w:pPr>
             <w:r>
               <w:rPr>
@@ -11249,6 +11635,7 @@
           <w:p>
             <w:pPr>
               <w:spacing w:line="240" w:lineRule="auto"/>
+              <w:jc w:val="left"/>
             </w:pPr>
             <w:r>
               <w:rPr>
@@ -11270,6 +11657,7 @@
           <w:p>
             <w:pPr>
               <w:spacing w:line="240" w:lineRule="auto"/>
+              <w:jc w:val="left"/>
             </w:pPr>
             <w:r>
               <w:rPr>
@@ -11289,6 +11677,7 @@
           <w:p>
             <w:pPr>
               <w:spacing w:line="240" w:lineRule="auto"/>
+              <w:jc w:val="left"/>
             </w:pPr>
             <w:r>
               <w:rPr>
@@ -11308,6 +11697,7 @@
           <w:p>
             <w:pPr>
               <w:spacing w:line="240" w:lineRule="auto"/>
+              <w:jc w:val="left"/>
             </w:pPr>
             <w:r>
               <w:rPr>
@@ -11329,6 +11719,7 @@
           <w:p>
             <w:pPr>
               <w:spacing w:line="240" w:lineRule="auto"/>
+              <w:jc w:val="left"/>
             </w:pPr>
             <w:r>
               <w:rPr>
@@ -11348,6 +11739,7 @@
           <w:p>
             <w:pPr>
               <w:spacing w:line="240" w:lineRule="auto"/>
+              <w:jc w:val="left"/>
             </w:pPr>
             <w:r>
               <w:rPr>
@@ -11367,6 +11759,7 @@
           <w:p>
             <w:pPr>
               <w:spacing w:line="240" w:lineRule="auto"/>
+              <w:jc w:val="left"/>
             </w:pPr>
             <w:r>
               <w:rPr>
@@ -11388,6 +11781,7 @@
           <w:p>
             <w:pPr>
               <w:spacing w:line="240" w:lineRule="auto"/>
+              <w:jc w:val="left"/>
             </w:pPr>
             <w:r>
               <w:rPr>
@@ -11407,6 +11801,7 @@
           <w:p>
             <w:pPr>
               <w:spacing w:line="240" w:lineRule="auto"/>
+              <w:jc w:val="left"/>
             </w:pPr>
             <w:r>
               <w:rPr>
@@ -11426,6 +11821,7 @@
           <w:p>
             <w:pPr>
               <w:spacing w:line="240" w:lineRule="auto"/>
+              <w:jc w:val="left"/>
             </w:pPr>
             <w:r>
               <w:rPr>
@@ -11447,6 +11843,7 @@
           <w:p>
             <w:pPr>
               <w:spacing w:line="240" w:lineRule="auto"/>
+              <w:jc w:val="left"/>
             </w:pPr>
             <w:r>
               <w:rPr>
@@ -11466,6 +11863,7 @@
           <w:p>
             <w:pPr>
               <w:spacing w:line="240" w:lineRule="auto"/>
+              <w:jc w:val="left"/>
             </w:pPr>
             <w:r>
               <w:rPr>
@@ -11485,6 +11883,7 @@
           <w:p>
             <w:pPr>
               <w:spacing w:line="240" w:lineRule="auto"/>
+              <w:jc w:val="left"/>
             </w:pPr>
             <w:r>
               <w:rPr>
@@ -11525,6 +11924,154 @@
           <w:sz w:val="28"/>
         </w:rPr>
         <w:t>Таким образом, система мотивации ПАО «ТНС энерго НН» является достаточно развитой и социально ориентированной. Она обеспечивает работникам стабильность, гарантии, регламентированную оплату труда и поддержку в значимых жизненных ситуациях. Основное ограничение состоит не в отсутствии мотивации, а в недостаточной адресности и прозрачности связи между индивидуальным вкладом работника, профессиональным ростом, признанием и вознаграждением. Эта проблема особенно актуальна в условиях отрицательного сальдо движения персонала и необходимости удерживать квалифицированные кадры в территориально распределенной энергосбытовой компании.</w:t>
+      </w:r>
+    </w:p>
+    <w:p>
+      <w:pPr>
+        <w:pStyle w:val="Heading2"/>
+      </w:pPr>
+      <w:r>
+        <w:t>Заключение</w:t>
+      </w:r>
+    </w:p>
+    <w:p>
+      <w:pPr>
+        <w:spacing w:line="360" w:lineRule="auto"/>
+        <w:ind w:firstLine="709"/>
+        <w:jc w:val="both"/>
+      </w:pPr>
+      <w:r>
+        <w:rPr>
+          <w:rFonts w:ascii="Times New Roman" w:hAnsi="Times New Roman" w:eastAsia="Times New Roman"/>
+          <w:sz w:val="28"/>
+        </w:rPr>
+        <w:t>В ходе преддипломной практики была рассмотрена деятельность ПАО «ТНС энерго Нижний Новгород» как крупной региональной энергосбытовой организации, выполняющей функции гарантирующего поставщика электроэнергии на территории Нижегородской области. Компания имеет публичный статус, входит в группу компаний «ТНС энерго», работает с населением, коммерческими организациями и иными потребителями, а также обеспечивает широкий комплекс расчетных, клиентских, правовых, финансовых и информационно-технологических процессов.</w:t>
+      </w:r>
+    </w:p>
+    <w:p>
+      <w:pPr>
+        <w:spacing w:line="360" w:lineRule="auto"/>
+        <w:ind w:firstLine="709"/>
+        <w:jc w:val="both"/>
+      </w:pPr>
+      <w:r>
+        <w:rPr>
+          <w:rFonts w:ascii="Times New Roman" w:hAnsi="Times New Roman" w:eastAsia="Times New Roman"/>
+          <w:sz w:val="28"/>
+        </w:rPr>
+        <w:t>В первой главе была дана общая характеристика предприятия, определены основные виды деятельности по ОКВЭД и рассмотрена организационно-управленческая структура. Основным видом деятельности компании является торговля электроэнергией по ОКВЭД 35.14. Дополнительные виды деятельности связаны с распределением электроэнергии, обслуживанием оборудования, управленческим консультированием и коммуникационными функциями. Анализ организационной структуры показал, что ПАО «ТНС энерго НН» использует линейно-функциональную модель управления с выделением ключевых направлений: экономика и финансы, реализация электроэнергии, работа с потребителями, правовое сопровождение, безопасность, системы учета, информационные технологии, управление персоналом и территориальные отделения.</w:t>
+      </w:r>
+    </w:p>
+    <w:p>
+      <w:pPr>
+        <w:spacing w:line="360" w:lineRule="auto"/>
+        <w:ind w:firstLine="709"/>
+        <w:jc w:val="both"/>
+      </w:pPr>
+      <w:r>
+        <w:rPr>
+          <w:rFonts w:ascii="Times New Roman" w:hAnsi="Times New Roman" w:eastAsia="Times New Roman"/>
+          <w:sz w:val="28"/>
+        </w:rPr>
+        <w:t>Финансовый анализ за 2023-2025 годы показал неоднозначную, но в целом улучшающуюся динамику. В 2025 году выручка выросла до 59,12 млрд руб., прибыль от продаж увеличилась, а чистый финансовый результат изменился с крупного убытка 2024 года на прибыль. Вместе с тем сохраняются ограничения, связанные с отрицательным собственным капиталом и значимостью дебиторской задолженности. Для кадровой политики это означает необходимость поддерживать баланс между экономической осторожностью и достаточным уровнем мотивации работников, поскольку качество персонала напрямую влияет на платежную дисциплину, клиентский сервис и устойчивость внутренних процессов.</w:t>
+      </w:r>
+    </w:p>
+    <w:p>
+      <w:pPr>
+        <w:spacing w:line="360" w:lineRule="auto"/>
+        <w:ind w:firstLine="709"/>
+        <w:jc w:val="both"/>
+      </w:pPr>
+      <w:r>
+        <w:rPr>
+          <w:rFonts w:ascii="Times New Roman" w:hAnsi="Times New Roman" w:eastAsia="Times New Roman"/>
+          <w:sz w:val="28"/>
+        </w:rPr>
+        <w:t>Во второй главе была проанализирована система управления персоналом предприятия. Установлено, что кадровая работа в ПАО «ТНС энерго НН» носит регламентированный и комплексный характер. Она включает подбор, прием, кадровое администрирование, организацию труда и оплаты, обучение, адаптацию, наставничество, социальную поддержку и взаимодействие с профсоюзной организацией. Важную роль играют коллективный договор на 2025-2027 годы, правила внутреннего трудового распорядка, регламент подбора персонала и положение об адаптации и наставничестве.</w:t>
+      </w:r>
+    </w:p>
+    <w:p>
+      <w:pPr>
+        <w:spacing w:line="360" w:lineRule="auto"/>
+        <w:ind w:firstLine="709"/>
+        <w:jc w:val="both"/>
+      </w:pPr>
+      <w:r>
+        <w:rPr>
+          <w:rFonts w:ascii="Times New Roman" w:hAnsi="Times New Roman" w:eastAsia="Times New Roman"/>
+          <w:sz w:val="28"/>
+        </w:rPr>
+        <w:t>Анализ движения персонала на март 2026 года показал, что в отчетном месяце было принято 9 работников, уволено 19 работников, коэффициент текучести составил 2,10%. При среднесписочной численности 901,8 человека и списочной численности 950 человек отрицательное сальдо движения персонала требует внимания со стороны HR-службы. Сам показатель за один месяц не позволяет говорить о критической ситуации, однако он указывает на необходимость системного анализа причин увольнений, особенно если подобная динамика повторяется.</w:t>
+      </w:r>
+    </w:p>
+    <w:p>
+      <w:pPr>
+        <w:spacing w:line="360" w:lineRule="auto"/>
+        <w:ind w:firstLine="709"/>
+        <w:jc w:val="both"/>
+      </w:pPr>
+      <w:r>
+        <w:rPr>
+          <w:rFonts w:ascii="Times New Roman" w:hAnsi="Times New Roman" w:eastAsia="Times New Roman"/>
+          <w:sz w:val="28"/>
+        </w:rPr>
+        <w:t>Отдельно была рассмотрена система подбора персонала. Компания использует внутренние и внешние источники поиска: внутренний портал, объявления на участках, ротацию персонала, центры занятости, социальные сети, учебные заведения, районные газеты и специализированные порталы трудоустройства. Существенное значение имеет hh.ru, где организация ежегодно публикует около 145 вакансий. Использование данного ресурса обосновано необходимостью оперативного закрытия вакансий и доступа к базе резюме.</w:t>
+      </w:r>
+    </w:p>
+    <w:p>
+      <w:pPr>
+        <w:spacing w:line="360" w:lineRule="auto"/>
+        <w:ind w:firstLine="709"/>
+        <w:jc w:val="both"/>
+      </w:pPr>
+      <w:r>
+        <w:rPr>
+          <w:rFonts w:ascii="Times New Roman" w:hAnsi="Times New Roman" w:eastAsia="Times New Roman"/>
+          <w:sz w:val="28"/>
+        </w:rPr>
+        <w:t>Адаптация и наставничество в компании выступают важными инструментами снижения текучести и передачи организационных знаний. Положение об адаптации и наставничестве предусматривает организационную, профессиональную и социально-психологическую адаптацию, индивидуальный план профессионального развития, ежемесячные и итоговые отчеты наставника, а также возможность доплаты наставнику до 20% должностного оклада. Наличие такой системы является сильной стороной управления персоналом, особенно с учетом территориальной распределенности подразделений.</w:t>
+      </w:r>
+    </w:p>
+    <w:p>
+      <w:pPr>
+        <w:spacing w:line="360" w:lineRule="auto"/>
+        <w:ind w:firstLine="709"/>
+        <w:jc w:val="both"/>
+      </w:pPr>
+      <w:r>
+        <w:rPr>
+          <w:rFonts w:ascii="Times New Roman" w:hAnsi="Times New Roman" w:eastAsia="Times New Roman"/>
+          <w:sz w:val="28"/>
+        </w:rPr>
+        <w:t>В третьей главе была подробно рассмотрена система мотивации сотрудников ПАО «ТНС энерго НН». Установлено, что она включает материальные, социальные, организационные и нематериальные стимулы. Материальная мотивация основана на тарифно-премиальной системе оплаты труда, премировании, доплатах, надбавках, индексации с учетом финансовых возможностей и выплатах наставникам. Социальная мотивация представлена широким набором гарантий: материальной помощью, выплатами при семейных обстоятельствах, компенсациями, дополнительными днями отдыха, поддержкой работников с детьми, юбилейными выплатами и помощью при выходе на пенсию.</w:t>
+      </w:r>
+    </w:p>
+    <w:p>
+      <w:pPr>
+        <w:spacing w:line="360" w:lineRule="auto"/>
+        <w:ind w:firstLine="709"/>
+        <w:jc w:val="both"/>
+      </w:pPr>
+      <w:r>
+        <w:rPr>
+          <w:rFonts w:ascii="Times New Roman" w:hAnsi="Times New Roman" w:eastAsia="Times New Roman"/>
+          <w:sz w:val="28"/>
+        </w:rPr>
+        <w:t>Нематериальная мотивация проявляется через корпоративные традиции, признание наставников, обучение, профессиональное развитие, социальное партнерство, участие в мероприятиях и поддержание благоприятного психологического климата. При этом анализ показал, что нематериальные стимулы описаны менее детально, чем материальные и социальные гарантии. В результате ключевой проблемой мотивационной системы определена недостаточная прозрачность индивидуальной связи между вкладом работника, качеством его работы, профессиональным развитием и получаемым вознаграждением или признанием.</w:t>
+      </w:r>
+    </w:p>
+    <w:p>
+      <w:pPr>
+        <w:spacing w:line="360" w:lineRule="auto"/>
+        <w:ind w:firstLine="709"/>
+        <w:jc w:val="both"/>
+      </w:pPr>
+      <w:r>
+        <w:rPr>
+          <w:rFonts w:ascii="Times New Roman" w:hAnsi="Times New Roman" w:eastAsia="Times New Roman"/>
+          <w:sz w:val="28"/>
+        </w:rPr>
+        <w:t>Итоговый вывод состоит в том, что ПАО «ТНС энерго НН» обладает развитой системой управления персоналом и достаточно широкой системой мотивации, основанной на локальных нормативных актах и социальном партнерстве. Сильными сторонами являются регламентированность кадровых процессов, наличие коллективного договора, развитый социальный пакет, система адаптации и наставничества, использование разных источников подбора и ориентация на профессиональное развитие работников. Основная зона дальнейшего анализа связана с повышением адресности мотивации, прозрачности критериев премирования и признания индивидуального вклада сотрудников. Данная проблема может быть использована как база для разработки практических рекомендаций в последующей части выпускной квалификационной работы.</w:t>
       </w:r>
     </w:p>
     <w:p>
@@ -12093,7 +12640,7 @@
       <w:b/>
       <w:bCs/>
       <w:color w:val="365F91" w:themeColor="accent1" w:themeShade="BF"/>
-      <w:sz w:val="28"/>
+      <w:sz w:val="32"/>
       <w:szCs w:val="28"/>
     </w:rPr>
   </w:style>
@@ -12117,7 +12664,7 @@
       <w:b/>
       <w:bCs/>
       <w:color w:val="4F81BD" w:themeColor="accent1"/>
-      <w:sz w:val="26"/>
+      <w:sz w:val="28"/>
       <w:szCs w:val="26"/>
     </w:rPr>
   </w:style>
@@ -12141,6 +12688,7 @@
       <w:b/>
       <w:bCs/>
       <w:color w:val="4F81BD" w:themeColor="accent1"/>
+      <w:sz w:val="28"/>
     </w:rPr>
   </w:style>
   <w:style w:type="paragraph" w:styleId="Heading4">

</xml_diff>